<commit_message>
agregar documentos en las fase y crear carpeta de cierre
</commit_message>
<xml_diff>
--- a/public/docs/fase1/epicas_ajuptel.docx
+++ b/public/docs/fase1/epicas_ajuptel.docx
@@ -40,11 +40,7 @@
               </w:rPr>
             </w:pPr>
             <w:r>
-              <w:rPr>
-                <w:rFonts w:eastAsia="Calibri"/>
-                <w:kern w:val="0"/>
-                <w:lang w:val="es-VE" w:eastAsia="es-VE" w:bidi="ar-SA"/>
-              </w:rPr>
+              <w:rPr/>
               <w:drawing>
                 <wp:inline distT="0" distB="0" distL="0" distR="0">
                   <wp:extent cx="997585" cy="988060"/>
@@ -639,7 +635,6 @@
           <w:szCs w:val="24"/>
         </w:rPr>
       </w:pPr>
-      <w:bookmarkStart w:id="1" w:name="_Hlk198103452"/>
       <w:r>
         <w:rPr>
           <w:rFonts w:cs="Arial" w:ascii="Arial" w:hAnsi="Arial"/>
@@ -728,7 +723,7 @@
           <w:szCs w:val="24"/>
         </w:rPr>
       </w:pPr>
-      <w:bookmarkStart w:id="2" w:name="_Hlk198103452"/>
+      <w:bookmarkStart w:id="1" w:name="_Hlk198103452"/>
       <w:r>
         <w:rPr>
           <w:rFonts w:cs="Arial" w:ascii="Arial" w:hAnsi="Arial"/>
@@ -737,7 +732,7 @@
         </w:rPr>
         <w:t xml:space="preserve">Mujica, Luis – C.I.: 7.090.613 </w:t>
       </w:r>
-      <w:bookmarkEnd w:id="2"/>
+      <w:bookmarkEnd w:id="1"/>
     </w:p>
     <w:p>
       <w:pPr>
@@ -1978,17 +1973,7 @@
                 <w:szCs w:val="24"/>
                 <w:lang w:val="es-ES" w:eastAsia="es-MX"/>
               </w:rPr>
-              <w:t>03</w:t>
-            </w:r>
-            <w:r>
-              <w:rPr>
-                <w:rFonts w:eastAsia="Times New Roman" w:cs="Arial" w:ascii="Arial" w:hAnsi="Arial"/>
-                <w:color w:val="000000"/>
-                <w:sz w:val="24"/>
-                <w:szCs w:val="24"/>
-                <w:lang w:val="es-ES" w:eastAsia="es-MX"/>
-              </w:rPr>
-              <w:t xml:space="preserve"> de Julio de 2026</w:t>
+              <w:t>03 de Julio de 2026</w:t>
             </w:r>
           </w:p>
         </w:tc>
@@ -3262,11 +3247,11 @@
         </w:tblCellMar>
       </w:tblPr>
       <w:tblGrid>
-        <w:gridCol w:w="2298"/>
-        <w:gridCol w:w="1949"/>
+        <w:gridCol w:w="2297"/>
+        <w:gridCol w:w="1950"/>
         <w:gridCol w:w="1827"/>
-        <w:gridCol w:w="3230"/>
-        <w:gridCol w:w="90"/>
+        <w:gridCol w:w="3229"/>
+        <w:gridCol w:w="91"/>
       </w:tblGrid>
       <w:tr>
         <w:trPr>
@@ -3274,7 +3259,7 @@
         </w:trPr>
         <w:tc>
           <w:tcPr>
-            <w:tcW w:w="2298" w:type="dxa"/>
+            <w:tcW w:w="2297" w:type="dxa"/>
             <w:tcBorders>
               <w:top w:val="single" w:sz="4" w:space="0" w:color="000000"/>
               <w:start w:val="single" w:sz="4" w:space="0" w:color="000000"/>
@@ -3348,7 +3333,7 @@
         </w:tc>
         <w:tc>
           <w:tcPr>
-            <w:tcW w:w="90" w:type="dxa"/>
+            <w:tcW w:w="91" w:type="dxa"/>
             <w:tcBorders/>
           </w:tcPr>
           <w:p>
@@ -3373,7 +3358,7 @@
         </w:trPr>
         <w:tc>
           <w:tcPr>
-            <w:tcW w:w="2298" w:type="dxa"/>
+            <w:tcW w:w="2297" w:type="dxa"/>
             <w:tcBorders>
               <w:start w:val="single" w:sz="4" w:space="0" w:color="000000"/>
               <w:bottom w:val="single" w:sz="4" w:space="0" w:color="000000"/>
@@ -3442,7 +3427,7 @@
         </w:tc>
         <w:tc>
           <w:tcPr>
-            <w:tcW w:w="90" w:type="dxa"/>
+            <w:tcW w:w="91" w:type="dxa"/>
             <w:tcBorders/>
           </w:tcPr>
           <w:p>
@@ -3467,7 +3452,7 @@
         </w:trPr>
         <w:tc>
           <w:tcPr>
-            <w:tcW w:w="2298" w:type="dxa"/>
+            <w:tcW w:w="2297" w:type="dxa"/>
             <w:tcBorders>
               <w:start w:val="single" w:sz="4" w:space="0" w:color="000000"/>
               <w:bottom w:val="single" w:sz="4" w:space="0" w:color="000000"/>
@@ -3536,7 +3521,7 @@
         </w:tc>
         <w:tc>
           <w:tcPr>
-            <w:tcW w:w="90" w:type="dxa"/>
+            <w:tcW w:w="91" w:type="dxa"/>
             <w:tcBorders/>
           </w:tcPr>
           <w:p>
@@ -3561,7 +3546,7 @@
         </w:trPr>
         <w:tc>
           <w:tcPr>
-            <w:tcW w:w="2298" w:type="dxa"/>
+            <w:tcW w:w="2297" w:type="dxa"/>
             <w:tcBorders>
               <w:start w:val="single" w:sz="4" w:space="0" w:color="000000"/>
               <w:bottom w:val="single" w:sz="4" w:space="0" w:color="000000"/>
@@ -3630,7 +3615,7 @@
         </w:tc>
         <w:tc>
           <w:tcPr>
-            <w:tcW w:w="90" w:type="dxa"/>
+            <w:tcW w:w="91" w:type="dxa"/>
             <w:tcBorders/>
           </w:tcPr>
           <w:p>
@@ -3655,7 +3640,7 @@
         </w:trPr>
         <w:tc>
           <w:tcPr>
-            <w:tcW w:w="2298" w:type="dxa"/>
+            <w:tcW w:w="2297" w:type="dxa"/>
             <w:tcBorders>
               <w:start w:val="single" w:sz="4" w:space="0" w:color="000000"/>
               <w:bottom w:val="single" w:sz="4" w:space="0" w:color="000000"/>
@@ -3724,7 +3709,7 @@
         </w:tc>
         <w:tc>
           <w:tcPr>
-            <w:tcW w:w="90" w:type="dxa"/>
+            <w:tcW w:w="91" w:type="dxa"/>
             <w:tcBorders/>
           </w:tcPr>
           <w:p>
@@ -3749,7 +3734,7 @@
         </w:trPr>
         <w:tc>
           <w:tcPr>
-            <w:tcW w:w="2298" w:type="dxa"/>
+            <w:tcW w:w="2297" w:type="dxa"/>
             <w:tcBorders>
               <w:start w:val="single" w:sz="4" w:space="0" w:color="000000"/>
               <w:bottom w:val="single" w:sz="4" w:space="0" w:color="000000"/>
@@ -3818,7 +3803,7 @@
         </w:tc>
         <w:tc>
           <w:tcPr>
-            <w:tcW w:w="90" w:type="dxa"/>
+            <w:tcW w:w="91" w:type="dxa"/>
             <w:tcBorders/>
           </w:tcPr>
           <w:p>
@@ -3843,7 +3828,7 @@
         </w:trPr>
         <w:tc>
           <w:tcPr>
-            <w:tcW w:w="9304" w:type="dxa"/>
+            <w:tcW w:w="9303" w:type="dxa"/>
             <w:gridSpan w:val="4"/>
             <w:tcBorders>
               <w:top w:val="single" w:sz="4" w:space="0" w:color="000000"/>
@@ -3885,7 +3870,7 @@
         </w:tc>
         <w:tc>
           <w:tcPr>
-            <w:tcW w:w="90" w:type="dxa"/>
+            <w:tcW w:w="91" w:type="dxa"/>
             <w:tcBorders/>
           </w:tcPr>
           <w:p>
@@ -3910,7 +3895,7 @@
         </w:trPr>
         <w:tc>
           <w:tcPr>
-            <w:tcW w:w="9304" w:type="dxa"/>
+            <w:tcW w:w="9303" w:type="dxa"/>
             <w:gridSpan w:val="4"/>
             <w:tcBorders>
               <w:top w:val="single" w:sz="4" w:space="0" w:color="000000"/>
@@ -3950,7 +3935,7 @@
         </w:tc>
         <w:tc>
           <w:tcPr>
-            <w:tcW w:w="90" w:type="dxa"/>
+            <w:tcW w:w="91" w:type="dxa"/>
             <w:tcBorders/>
           </w:tcPr>
           <w:p>
@@ -3975,7 +3960,7 @@
         </w:trPr>
         <w:tc>
           <w:tcPr>
-            <w:tcW w:w="2298" w:type="dxa"/>
+            <w:tcW w:w="2297" w:type="dxa"/>
             <w:vMerge w:val="restart"/>
             <w:tcBorders>
               <w:start w:val="single" w:sz="4" w:space="0" w:color="000000"/>
@@ -4051,7 +4036,7 @@
         </w:tc>
         <w:tc>
           <w:tcPr>
-            <w:tcW w:w="90" w:type="dxa"/>
+            <w:tcW w:w="91" w:type="dxa"/>
             <w:tcBorders/>
           </w:tcPr>
           <w:p>
@@ -4076,7 +4061,7 @@
         </w:trPr>
         <w:tc>
           <w:tcPr>
-            <w:tcW w:w="2298" w:type="dxa"/>
+            <w:tcW w:w="2297" w:type="dxa"/>
             <w:vMerge w:val="continue"/>
             <w:tcBorders>
               <w:start w:val="single" w:sz="4" w:space="0" w:color="000000"/>
@@ -4128,7 +4113,7 @@
         </w:tc>
         <w:tc>
           <w:tcPr>
-            <w:tcW w:w="90" w:type="dxa"/>
+            <w:tcW w:w="91" w:type="dxa"/>
             <w:tcBorders/>
             <w:vAlign w:val="bottom"/>
           </w:tcPr>
@@ -4162,7 +4147,7 @@
         </w:trPr>
         <w:tc>
           <w:tcPr>
-            <w:tcW w:w="2298" w:type="dxa"/>
+            <w:tcW w:w="2297" w:type="dxa"/>
             <w:tcBorders>
               <w:start w:val="single" w:sz="4" w:space="0" w:color="000000"/>
               <w:bottom w:val="single" w:sz="4" w:space="0" w:color="000000"/>
@@ -4235,7 +4220,7 @@
         </w:tc>
         <w:tc>
           <w:tcPr>
-            <w:tcW w:w="90" w:type="dxa"/>
+            <w:tcW w:w="91" w:type="dxa"/>
             <w:tcBorders/>
             <w:vAlign w:val="center"/>
           </w:tcPr>
@@ -4267,7 +4252,7 @@
         </w:trPr>
         <w:tc>
           <w:tcPr>
-            <w:tcW w:w="2298" w:type="dxa"/>
+            <w:tcW w:w="2297" w:type="dxa"/>
             <w:tcBorders>
               <w:start w:val="single" w:sz="4" w:space="0" w:color="000000"/>
               <w:bottom w:val="single" w:sz="4" w:space="0" w:color="000000"/>
@@ -4340,7 +4325,7 @@
         </w:tc>
         <w:tc>
           <w:tcPr>
-            <w:tcW w:w="90" w:type="dxa"/>
+            <w:tcW w:w="91" w:type="dxa"/>
             <w:tcBorders/>
             <w:vAlign w:val="center"/>
           </w:tcPr>
@@ -4372,7 +4357,7 @@
         </w:trPr>
         <w:tc>
           <w:tcPr>
-            <w:tcW w:w="2298" w:type="dxa"/>
+            <w:tcW w:w="2297" w:type="dxa"/>
             <w:tcBorders>
               <w:start w:val="single" w:sz="4" w:space="0" w:color="000000"/>
               <w:bottom w:val="single" w:sz="4" w:space="0" w:color="000000"/>
@@ -4412,7 +4397,7 @@
         </w:tc>
         <w:tc>
           <w:tcPr>
-            <w:tcW w:w="1949" w:type="dxa"/>
+            <w:tcW w:w="1950" w:type="dxa"/>
             <w:tcBorders>
               <w:bottom w:val="single" w:sz="4" w:space="0" w:color="000000"/>
               <w:end w:val="single" w:sz="4" w:space="0" w:color="000000"/>
@@ -4490,7 +4475,7 @@
         </w:tc>
         <w:tc>
           <w:tcPr>
-            <w:tcW w:w="3230" w:type="dxa"/>
+            <w:tcW w:w="3229" w:type="dxa"/>
             <w:tcBorders>
               <w:bottom w:val="single" w:sz="4" w:space="0" w:color="000000"/>
               <w:end w:val="single" w:sz="4" w:space="0" w:color="000000"/>
@@ -4529,7 +4514,7 @@
         </w:tc>
         <w:tc>
           <w:tcPr>
-            <w:tcW w:w="90" w:type="dxa"/>
+            <w:tcW w:w="91" w:type="dxa"/>
             <w:tcBorders/>
             <w:vAlign w:val="center"/>
           </w:tcPr>
@@ -4561,7 +4546,7 @@
         </w:trPr>
         <w:tc>
           <w:tcPr>
-            <w:tcW w:w="2298" w:type="dxa"/>
+            <w:tcW w:w="2297" w:type="dxa"/>
             <w:tcBorders>
               <w:start w:val="single" w:sz="4" w:space="0" w:color="000000"/>
               <w:bottom w:val="single" w:sz="4" w:space="0" w:color="000000"/>
@@ -4600,7 +4585,7 @@
         </w:tc>
         <w:tc>
           <w:tcPr>
-            <w:tcW w:w="1949" w:type="dxa"/>
+            <w:tcW w:w="1950" w:type="dxa"/>
             <w:tcBorders>
               <w:bottom w:val="single" w:sz="4" w:space="0" w:color="000000"/>
               <w:end w:val="single" w:sz="4" w:space="0" w:color="000000"/>
@@ -4668,7 +4653,7 @@
         </w:tc>
         <w:tc>
           <w:tcPr>
-            <w:tcW w:w="3230" w:type="dxa"/>
+            <w:tcW w:w="3229" w:type="dxa"/>
             <w:tcBorders>
               <w:bottom w:val="single" w:sz="4" w:space="0" w:color="000000"/>
               <w:end w:val="single" w:sz="4" w:space="0" w:color="000000"/>
@@ -4702,7 +4687,7 @@
         </w:tc>
         <w:tc>
           <w:tcPr>
-            <w:tcW w:w="90" w:type="dxa"/>
+            <w:tcW w:w="91" w:type="dxa"/>
             <w:tcBorders/>
             <w:vAlign w:val="center"/>
           </w:tcPr>
@@ -4734,7 +4719,7 @@
         </w:trPr>
         <w:tc>
           <w:tcPr>
-            <w:tcW w:w="2298" w:type="dxa"/>
+            <w:tcW w:w="2297" w:type="dxa"/>
             <w:tcBorders>
               <w:start w:val="single" w:sz="4" w:space="0" w:color="000000"/>
               <w:bottom w:val="single" w:sz="4" w:space="0" w:color="000000"/>
@@ -4773,7 +4758,7 @@
         </w:tc>
         <w:tc>
           <w:tcPr>
-            <w:tcW w:w="1949" w:type="dxa"/>
+            <w:tcW w:w="1950" w:type="dxa"/>
             <w:tcBorders>
               <w:bottom w:val="single" w:sz="4" w:space="0" w:color="000000"/>
               <w:end w:val="single" w:sz="4" w:space="0" w:color="000000"/>
@@ -4841,7 +4826,7 @@
         </w:tc>
         <w:tc>
           <w:tcPr>
-            <w:tcW w:w="3230" w:type="dxa"/>
+            <w:tcW w:w="3229" w:type="dxa"/>
             <w:tcBorders>
               <w:bottom w:val="single" w:sz="4" w:space="0" w:color="000000"/>
               <w:end w:val="single" w:sz="4" w:space="0" w:color="000000"/>
@@ -4875,7 +4860,7 @@
         </w:tc>
         <w:tc>
           <w:tcPr>
-            <w:tcW w:w="90" w:type="dxa"/>
+            <w:tcW w:w="91" w:type="dxa"/>
             <w:tcBorders/>
             <w:vAlign w:val="center"/>
           </w:tcPr>
@@ -4907,7 +4892,7 @@
         </w:trPr>
         <w:tc>
           <w:tcPr>
-            <w:tcW w:w="2298" w:type="dxa"/>
+            <w:tcW w:w="2297" w:type="dxa"/>
             <w:tcBorders>
               <w:start w:val="single" w:sz="4" w:space="0" w:color="000000"/>
               <w:bottom w:val="single" w:sz="4" w:space="0" w:color="000000"/>
@@ -4946,7 +4931,7 @@
         </w:tc>
         <w:tc>
           <w:tcPr>
-            <w:tcW w:w="1949" w:type="dxa"/>
+            <w:tcW w:w="1950" w:type="dxa"/>
             <w:tcBorders>
               <w:bottom w:val="single" w:sz="4" w:space="0" w:color="000000"/>
               <w:end w:val="single" w:sz="4" w:space="0" w:color="000000"/>
@@ -5014,7 +4999,7 @@
         </w:tc>
         <w:tc>
           <w:tcPr>
-            <w:tcW w:w="3230" w:type="dxa"/>
+            <w:tcW w:w="3229" w:type="dxa"/>
             <w:tcBorders>
               <w:bottom w:val="single" w:sz="4" w:space="0" w:color="000000"/>
               <w:end w:val="single" w:sz="4" w:space="0" w:color="000000"/>
@@ -5048,7 +5033,7 @@
         </w:tc>
         <w:tc>
           <w:tcPr>
-            <w:tcW w:w="90" w:type="dxa"/>
+            <w:tcW w:w="91" w:type="dxa"/>
             <w:tcBorders/>
             <w:vAlign w:val="center"/>
           </w:tcPr>
@@ -5080,7 +5065,7 @@
         </w:trPr>
         <w:tc>
           <w:tcPr>
-            <w:tcW w:w="2298" w:type="dxa"/>
+            <w:tcW w:w="2297" w:type="dxa"/>
             <w:tcBorders>
               <w:start w:val="single" w:sz="4" w:space="0" w:color="000000"/>
               <w:bottom w:val="single" w:sz="4" w:space="0" w:color="000000"/>
@@ -5119,7 +5104,7 @@
         </w:tc>
         <w:tc>
           <w:tcPr>
-            <w:tcW w:w="1949" w:type="dxa"/>
+            <w:tcW w:w="1950" w:type="dxa"/>
             <w:tcBorders>
               <w:bottom w:val="single" w:sz="4" w:space="0" w:color="000000"/>
               <w:end w:val="single" w:sz="4" w:space="0" w:color="000000"/>
@@ -5187,7 +5172,7 @@
         </w:tc>
         <w:tc>
           <w:tcPr>
-            <w:tcW w:w="3230" w:type="dxa"/>
+            <w:tcW w:w="3229" w:type="dxa"/>
             <w:tcBorders>
               <w:bottom w:val="single" w:sz="4" w:space="0" w:color="000000"/>
               <w:end w:val="single" w:sz="4" w:space="0" w:color="000000"/>
@@ -5221,7 +5206,7 @@
         </w:tc>
         <w:tc>
           <w:tcPr>
-            <w:tcW w:w="90" w:type="dxa"/>
+            <w:tcW w:w="91" w:type="dxa"/>
             <w:tcBorders/>
             <w:vAlign w:val="center"/>
           </w:tcPr>
@@ -5253,7 +5238,7 @@
         </w:trPr>
         <w:tc>
           <w:tcPr>
-            <w:tcW w:w="2298" w:type="dxa"/>
+            <w:tcW w:w="2297" w:type="dxa"/>
             <w:tcBorders>
               <w:start w:val="single" w:sz="4" w:space="0" w:color="000000"/>
               <w:bottom w:val="single" w:sz="4" w:space="0" w:color="000000"/>
@@ -5292,7 +5277,7 @@
         </w:tc>
         <w:tc>
           <w:tcPr>
-            <w:tcW w:w="1949" w:type="dxa"/>
+            <w:tcW w:w="1950" w:type="dxa"/>
             <w:tcBorders>
               <w:bottom w:val="single" w:sz="4" w:space="0" w:color="000000"/>
               <w:end w:val="single" w:sz="4" w:space="0" w:color="000000"/>
@@ -5360,7 +5345,7 @@
         </w:tc>
         <w:tc>
           <w:tcPr>
-            <w:tcW w:w="3230" w:type="dxa"/>
+            <w:tcW w:w="3229" w:type="dxa"/>
             <w:tcBorders>
               <w:bottom w:val="single" w:sz="4" w:space="0" w:color="000000"/>
               <w:end w:val="single" w:sz="4" w:space="0" w:color="000000"/>
@@ -5394,7 +5379,7 @@
         </w:tc>
         <w:tc>
           <w:tcPr>
-            <w:tcW w:w="90" w:type="dxa"/>
+            <w:tcW w:w="91" w:type="dxa"/>
             <w:tcBorders/>
             <w:vAlign w:val="center"/>
           </w:tcPr>
@@ -5426,7 +5411,7 @@
         </w:trPr>
         <w:tc>
           <w:tcPr>
-            <w:tcW w:w="2298" w:type="dxa"/>
+            <w:tcW w:w="2297" w:type="dxa"/>
             <w:tcBorders>
               <w:start w:val="single" w:sz="4" w:space="0" w:color="000000"/>
               <w:bottom w:val="single" w:sz="4" w:space="0" w:color="000000"/>
@@ -5465,7 +5450,7 @@
         </w:tc>
         <w:tc>
           <w:tcPr>
-            <w:tcW w:w="1949" w:type="dxa"/>
+            <w:tcW w:w="1950" w:type="dxa"/>
             <w:tcBorders>
               <w:bottom w:val="single" w:sz="4" w:space="0" w:color="000000"/>
               <w:end w:val="single" w:sz="4" w:space="0" w:color="000000"/>
@@ -5533,7 +5518,7 @@
         </w:tc>
         <w:tc>
           <w:tcPr>
-            <w:tcW w:w="3230" w:type="dxa"/>
+            <w:tcW w:w="3229" w:type="dxa"/>
             <w:tcBorders>
               <w:bottom w:val="single" w:sz="4" w:space="0" w:color="000000"/>
               <w:end w:val="single" w:sz="4" w:space="0" w:color="000000"/>
@@ -5567,7 +5552,7 @@
         </w:tc>
         <w:tc>
           <w:tcPr>
-            <w:tcW w:w="90" w:type="dxa"/>
+            <w:tcW w:w="91" w:type="dxa"/>
             <w:tcBorders/>
             <w:vAlign w:val="center"/>
           </w:tcPr>
@@ -5596,16 +5581,6 @@
     </w:tbl>
     <w:p>
       <w:pPr>
-        <w:pStyle w:val="Normal"/>
-        <w:widowControl w:val="false"/>
-        <w:suppressAutoHyphens w:val="true"/>
-        <w:spacing w:lineRule="auto" w:line="240" w:before="100" w:after="0"/>
-        <w:rPr>
-          <w:rFonts w:ascii="Arial" w:hAnsi="Arial" w:eastAsia="Bahnschrift" w:cs="Arial"/>
-          <w:sz w:val="24"/>
-          <w:szCs w:val="24"/>
-          <w:lang w:val="es-MX" w:eastAsia="en-US"/>
-        </w:rPr>
         <w:sectPr>
           <w:type w:val="nextPage"/>
           <w:pgSz w:w="12240" w:h="15840"/>
@@ -5616,14 +5591,6 @@
           <w:docGrid w:type="default" w:linePitch="100" w:charSpace="0"/>
         </w:sectPr>
       </w:pPr>
-      <w:r>
-        <w:rPr>
-          <w:rFonts w:eastAsia="Bahnschrift" w:cs="Arial" w:ascii="Arial" w:hAnsi="Arial"/>
-          <w:sz w:val="24"/>
-          <w:szCs w:val="24"/>
-          <w:lang w:val="es-MX" w:eastAsia="en-US"/>
-        </w:rPr>
-      </w:r>
     </w:p>
     <w:p>
       <w:pPr>
@@ -5661,9 +5628,9 @@
         </w:tblCellMar>
       </w:tblPr>
       <w:tblGrid>
-        <w:gridCol w:w="1876"/>
+        <w:gridCol w:w="1875"/>
         <w:gridCol w:w="1586"/>
-        <w:gridCol w:w="1631"/>
+        <w:gridCol w:w="1632"/>
         <w:gridCol w:w="4301"/>
       </w:tblGrid>
       <w:tr>
@@ -5672,7 +5639,7 @@
         </w:trPr>
         <w:tc>
           <w:tcPr>
-            <w:tcW w:w="1876" w:type="dxa"/>
+            <w:tcW w:w="1875" w:type="dxa"/>
             <w:tcBorders>
               <w:top w:val="single" w:sz="4" w:space="0" w:color="000000"/>
               <w:start w:val="single" w:sz="4" w:space="0" w:color="000000"/>
@@ -5707,7 +5674,7 @@
         </w:tc>
         <w:tc>
           <w:tcPr>
-            <w:tcW w:w="7518" w:type="dxa"/>
+            <w:tcW w:w="7519" w:type="dxa"/>
             <w:gridSpan w:val="3"/>
             <w:tcBorders>
               <w:top w:val="single" w:sz="4" w:space="0" w:color="000000"/>
@@ -5751,7 +5718,7 @@
         </w:trPr>
         <w:tc>
           <w:tcPr>
-            <w:tcW w:w="1876" w:type="dxa"/>
+            <w:tcW w:w="1875" w:type="dxa"/>
             <w:tcBorders>
               <w:start w:val="single" w:sz="4" w:space="0" w:color="000000"/>
               <w:bottom w:val="single" w:sz="4" w:space="0" w:color="000000"/>
@@ -5785,7 +5752,7 @@
         </w:tc>
         <w:tc>
           <w:tcPr>
-            <w:tcW w:w="7518" w:type="dxa"/>
+            <w:tcW w:w="7519" w:type="dxa"/>
             <w:gridSpan w:val="3"/>
             <w:tcBorders>
               <w:top w:val="single" w:sz="4" w:space="0" w:color="000000"/>
@@ -5825,7 +5792,7 @@
         </w:trPr>
         <w:tc>
           <w:tcPr>
-            <w:tcW w:w="1876" w:type="dxa"/>
+            <w:tcW w:w="1875" w:type="dxa"/>
             <w:tcBorders>
               <w:start w:val="single" w:sz="4" w:space="0" w:color="000000"/>
               <w:bottom w:val="single" w:sz="4" w:space="0" w:color="000000"/>
@@ -5859,7 +5826,7 @@
         </w:tc>
         <w:tc>
           <w:tcPr>
-            <w:tcW w:w="7518" w:type="dxa"/>
+            <w:tcW w:w="7519" w:type="dxa"/>
             <w:gridSpan w:val="3"/>
             <w:tcBorders>
               <w:top w:val="single" w:sz="4" w:space="0" w:color="000000"/>
@@ -5899,7 +5866,7 @@
         </w:trPr>
         <w:tc>
           <w:tcPr>
-            <w:tcW w:w="1876" w:type="dxa"/>
+            <w:tcW w:w="1875" w:type="dxa"/>
             <w:tcBorders>
               <w:start w:val="single" w:sz="4" w:space="0" w:color="000000"/>
               <w:bottom w:val="single" w:sz="4" w:space="0" w:color="000000"/>
@@ -5933,7 +5900,7 @@
         </w:tc>
         <w:tc>
           <w:tcPr>
-            <w:tcW w:w="7518" w:type="dxa"/>
+            <w:tcW w:w="7519" w:type="dxa"/>
             <w:gridSpan w:val="3"/>
             <w:tcBorders>
               <w:top w:val="single" w:sz="4" w:space="0" w:color="000000"/>
@@ -5973,7 +5940,7 @@
         </w:trPr>
         <w:tc>
           <w:tcPr>
-            <w:tcW w:w="1876" w:type="dxa"/>
+            <w:tcW w:w="1875" w:type="dxa"/>
             <w:tcBorders>
               <w:start w:val="single" w:sz="4" w:space="0" w:color="000000"/>
               <w:bottom w:val="single" w:sz="4" w:space="0" w:color="000000"/>
@@ -6007,7 +5974,7 @@
         </w:tc>
         <w:tc>
           <w:tcPr>
-            <w:tcW w:w="7518" w:type="dxa"/>
+            <w:tcW w:w="7519" w:type="dxa"/>
             <w:gridSpan w:val="3"/>
             <w:tcBorders>
               <w:top w:val="single" w:sz="4" w:space="0" w:color="000000"/>
@@ -6047,7 +6014,7 @@
         </w:trPr>
         <w:tc>
           <w:tcPr>
-            <w:tcW w:w="1876" w:type="dxa"/>
+            <w:tcW w:w="1875" w:type="dxa"/>
             <w:tcBorders>
               <w:start w:val="single" w:sz="4" w:space="0" w:color="000000"/>
               <w:bottom w:val="single" w:sz="4" w:space="0" w:color="000000"/>
@@ -6081,7 +6048,7 @@
         </w:tc>
         <w:tc>
           <w:tcPr>
-            <w:tcW w:w="7518" w:type="dxa"/>
+            <w:tcW w:w="7519" w:type="dxa"/>
             <w:gridSpan w:val="3"/>
             <w:tcBorders>
               <w:top w:val="single" w:sz="4" w:space="0" w:color="000000"/>
@@ -6210,7 +6177,7 @@
         </w:trPr>
         <w:tc>
           <w:tcPr>
-            <w:tcW w:w="3462" w:type="dxa"/>
+            <w:tcW w:w="3461" w:type="dxa"/>
             <w:gridSpan w:val="2"/>
             <w:tcBorders>
               <w:top w:val="single" w:sz="4" w:space="0" w:color="000000"/>
@@ -6250,7 +6217,7 @@
         </w:tc>
         <w:tc>
           <w:tcPr>
-            <w:tcW w:w="5932" w:type="dxa"/>
+            <w:tcW w:w="5933" w:type="dxa"/>
             <w:gridSpan w:val="2"/>
             <w:tcBorders>
               <w:top w:val="single" w:sz="4" w:space="0" w:color="000000"/>
@@ -6290,7 +6257,7 @@
         </w:trPr>
         <w:tc>
           <w:tcPr>
-            <w:tcW w:w="3462" w:type="dxa"/>
+            <w:tcW w:w="3461" w:type="dxa"/>
             <w:gridSpan w:val="2"/>
             <w:tcBorders>
               <w:top w:val="single" w:sz="4" w:space="0" w:color="000000"/>
@@ -6330,7 +6297,7 @@
         </w:tc>
         <w:tc>
           <w:tcPr>
-            <w:tcW w:w="5932" w:type="dxa"/>
+            <w:tcW w:w="5933" w:type="dxa"/>
             <w:gridSpan w:val="2"/>
             <w:tcBorders>
               <w:top w:val="single" w:sz="4" w:space="0" w:color="000000"/>
@@ -6370,7 +6337,7 @@
         </w:trPr>
         <w:tc>
           <w:tcPr>
-            <w:tcW w:w="3462" w:type="dxa"/>
+            <w:tcW w:w="3461" w:type="dxa"/>
             <w:gridSpan w:val="2"/>
             <w:tcBorders>
               <w:top w:val="single" w:sz="4" w:space="0" w:color="000000"/>
@@ -6410,7 +6377,7 @@
         </w:tc>
         <w:tc>
           <w:tcPr>
-            <w:tcW w:w="5932" w:type="dxa"/>
+            <w:tcW w:w="5933" w:type="dxa"/>
             <w:gridSpan w:val="2"/>
             <w:tcBorders>
               <w:top w:val="single" w:sz="4" w:space="0" w:color="000000"/>
@@ -6450,7 +6417,7 @@
         </w:trPr>
         <w:tc>
           <w:tcPr>
-            <w:tcW w:w="1876" w:type="dxa"/>
+            <w:tcW w:w="1875" w:type="dxa"/>
             <w:tcBorders>
               <w:start w:val="single" w:sz="4" w:space="0" w:color="000000"/>
               <w:bottom w:val="single" w:sz="4" w:space="0" w:color="000000"/>
@@ -6528,7 +6495,7 @@
         </w:tc>
         <w:tc>
           <w:tcPr>
-            <w:tcW w:w="1631" w:type="dxa"/>
+            <w:tcW w:w="1632" w:type="dxa"/>
             <w:tcBorders>
               <w:bottom w:val="single" w:sz="4" w:space="0" w:color="000000"/>
               <w:end w:val="single" w:sz="4" w:space="0" w:color="000000"/>
@@ -6611,7 +6578,7 @@
         </w:trPr>
         <w:tc>
           <w:tcPr>
-            <w:tcW w:w="1876" w:type="dxa"/>
+            <w:tcW w:w="1875" w:type="dxa"/>
             <w:tcBorders>
               <w:start w:val="single" w:sz="4" w:space="0" w:color="000000"/>
               <w:bottom w:val="single" w:sz="4" w:space="0" w:color="000000"/>
@@ -6683,7 +6650,7 @@
         </w:tc>
         <w:tc>
           <w:tcPr>
-            <w:tcW w:w="1631" w:type="dxa"/>
+            <w:tcW w:w="1632" w:type="dxa"/>
             <w:tcBorders>
               <w:bottom w:val="single" w:sz="4" w:space="0" w:color="000000"/>
               <w:end w:val="single" w:sz="4" w:space="0" w:color="000000"/>
@@ -6756,7 +6723,7 @@
         </w:trPr>
         <w:tc>
           <w:tcPr>
-            <w:tcW w:w="1876" w:type="dxa"/>
+            <w:tcW w:w="1875" w:type="dxa"/>
             <w:tcBorders>
               <w:start w:val="single" w:sz="4" w:space="0" w:color="000000"/>
               <w:bottom w:val="single" w:sz="4" w:space="0" w:color="000000"/>
@@ -6828,7 +6795,7 @@
         </w:tc>
         <w:tc>
           <w:tcPr>
-            <w:tcW w:w="1631" w:type="dxa"/>
+            <w:tcW w:w="1632" w:type="dxa"/>
             <w:tcBorders>
               <w:bottom w:val="single" w:sz="4" w:space="0" w:color="000000"/>
               <w:end w:val="single" w:sz="4" w:space="0" w:color="000000"/>
@@ -6901,7 +6868,7 @@
         </w:trPr>
         <w:tc>
           <w:tcPr>
-            <w:tcW w:w="1876" w:type="dxa"/>
+            <w:tcW w:w="1875" w:type="dxa"/>
             <w:tcBorders>
               <w:start w:val="single" w:sz="4" w:space="0" w:color="000000"/>
               <w:bottom w:val="single" w:sz="4" w:space="0" w:color="000000"/>
@@ -6973,7 +6940,7 @@
         </w:tc>
         <w:tc>
           <w:tcPr>
-            <w:tcW w:w="1631" w:type="dxa"/>
+            <w:tcW w:w="1632" w:type="dxa"/>
             <w:tcBorders>
               <w:bottom w:val="single" w:sz="4" w:space="0" w:color="000000"/>
               <w:end w:val="single" w:sz="4" w:space="0" w:color="000000"/>
@@ -7069,8 +7036,8 @@
       </w:tblPr>
       <w:tblGrid>
         <w:gridCol w:w="2170"/>
-        <w:gridCol w:w="1773"/>
-        <w:gridCol w:w="1834"/>
+        <w:gridCol w:w="1772"/>
+        <w:gridCol w:w="1835"/>
         <w:gridCol w:w="3617"/>
       </w:tblGrid>
       <w:tr>
@@ -7617,7 +7584,7 @@
         </w:trPr>
         <w:tc>
           <w:tcPr>
-            <w:tcW w:w="3943" w:type="dxa"/>
+            <w:tcW w:w="3942" w:type="dxa"/>
             <w:gridSpan w:val="2"/>
             <w:tcBorders>
               <w:top w:val="single" w:sz="4" w:space="0" w:color="000000"/>
@@ -7657,7 +7624,7 @@
         </w:tc>
         <w:tc>
           <w:tcPr>
-            <w:tcW w:w="5451" w:type="dxa"/>
+            <w:tcW w:w="5452" w:type="dxa"/>
             <w:gridSpan w:val="2"/>
             <w:tcBorders>
               <w:top w:val="single" w:sz="4" w:space="0" w:color="000000"/>
@@ -7697,7 +7664,7 @@
         </w:trPr>
         <w:tc>
           <w:tcPr>
-            <w:tcW w:w="3943" w:type="dxa"/>
+            <w:tcW w:w="3942" w:type="dxa"/>
             <w:gridSpan w:val="2"/>
             <w:tcBorders>
               <w:top w:val="single" w:sz="4" w:space="0" w:color="000000"/>
@@ -7737,7 +7704,7 @@
         </w:tc>
         <w:tc>
           <w:tcPr>
-            <w:tcW w:w="5451" w:type="dxa"/>
+            <w:tcW w:w="5452" w:type="dxa"/>
             <w:gridSpan w:val="2"/>
             <w:tcBorders>
               <w:top w:val="single" w:sz="4" w:space="0" w:color="000000"/>
@@ -7777,7 +7744,7 @@
         </w:trPr>
         <w:tc>
           <w:tcPr>
-            <w:tcW w:w="3943" w:type="dxa"/>
+            <w:tcW w:w="3942" w:type="dxa"/>
             <w:gridSpan w:val="2"/>
             <w:tcBorders>
               <w:top w:val="single" w:sz="4" w:space="0" w:color="000000"/>
@@ -7817,7 +7784,7 @@
         </w:tc>
         <w:tc>
           <w:tcPr>
-            <w:tcW w:w="5451" w:type="dxa"/>
+            <w:tcW w:w="5452" w:type="dxa"/>
             <w:gridSpan w:val="2"/>
             <w:tcBorders>
               <w:top w:val="single" w:sz="4" w:space="0" w:color="000000"/>
@@ -7897,7 +7864,7 @@
         </w:tc>
         <w:tc>
           <w:tcPr>
-            <w:tcW w:w="1773" w:type="dxa"/>
+            <w:tcW w:w="1772" w:type="dxa"/>
             <w:tcBorders>
               <w:bottom w:val="single" w:sz="4" w:space="0" w:color="000000"/>
               <w:end w:val="single" w:sz="4" w:space="0" w:color="000000"/>
@@ -7935,7 +7902,7 @@
         </w:tc>
         <w:tc>
           <w:tcPr>
-            <w:tcW w:w="1834" w:type="dxa"/>
+            <w:tcW w:w="1835" w:type="dxa"/>
             <w:tcBorders>
               <w:bottom w:val="single" w:sz="4" w:space="0" w:color="000000"/>
               <w:end w:val="single" w:sz="4" w:space="0" w:color="000000"/>
@@ -8057,7 +8024,7 @@
         </w:tc>
         <w:tc>
           <w:tcPr>
-            <w:tcW w:w="1773" w:type="dxa"/>
+            <w:tcW w:w="1772" w:type="dxa"/>
             <w:tcBorders>
               <w:bottom w:val="single" w:sz="4" w:space="0" w:color="000000"/>
               <w:end w:val="single" w:sz="4" w:space="0" w:color="000000"/>
@@ -8090,7 +8057,7 @@
         </w:tc>
         <w:tc>
           <w:tcPr>
-            <w:tcW w:w="1834" w:type="dxa"/>
+            <w:tcW w:w="1835" w:type="dxa"/>
             <w:tcBorders>
               <w:bottom w:val="single" w:sz="4" w:space="0" w:color="000000"/>
               <w:end w:val="single" w:sz="4" w:space="0" w:color="000000"/>
@@ -8202,7 +8169,7 @@
         </w:tc>
         <w:tc>
           <w:tcPr>
-            <w:tcW w:w="1773" w:type="dxa"/>
+            <w:tcW w:w="1772" w:type="dxa"/>
             <w:tcBorders>
               <w:bottom w:val="single" w:sz="4" w:space="0" w:color="000000"/>
               <w:end w:val="single" w:sz="4" w:space="0" w:color="000000"/>
@@ -8235,7 +8202,7 @@
         </w:tc>
         <w:tc>
           <w:tcPr>
-            <w:tcW w:w="1834" w:type="dxa"/>
+            <w:tcW w:w="1835" w:type="dxa"/>
             <w:tcBorders>
               <w:bottom w:val="single" w:sz="4" w:space="0" w:color="000000"/>
               <w:end w:val="single" w:sz="4" w:space="0" w:color="000000"/>
@@ -8347,7 +8314,7 @@
         </w:tc>
         <w:tc>
           <w:tcPr>
-            <w:tcW w:w="1773" w:type="dxa"/>
+            <w:tcW w:w="1772" w:type="dxa"/>
             <w:tcBorders>
               <w:bottom w:val="single" w:sz="4" w:space="0" w:color="000000"/>
               <w:end w:val="single" w:sz="4" w:space="0" w:color="000000"/>
@@ -8380,7 +8347,7 @@
         </w:tc>
         <w:tc>
           <w:tcPr>
-            <w:tcW w:w="1834" w:type="dxa"/>
+            <w:tcW w:w="1835" w:type="dxa"/>
             <w:tcBorders>
               <w:bottom w:val="single" w:sz="4" w:space="0" w:color="000000"/>
               <w:end w:val="single" w:sz="4" w:space="0" w:color="000000"/>
@@ -8493,7 +8460,7 @@
         </w:tc>
         <w:tc>
           <w:tcPr>
-            <w:tcW w:w="1773" w:type="dxa"/>
+            <w:tcW w:w="1772" w:type="dxa"/>
             <w:tcBorders>
               <w:top w:val="single" w:sz="4" w:space="0" w:color="000000"/>
               <w:start w:val="single" w:sz="4" w:space="0" w:color="000000"/>
@@ -8528,7 +8495,7 @@
         </w:tc>
         <w:tc>
           <w:tcPr>
-            <w:tcW w:w="1834" w:type="dxa"/>
+            <w:tcW w:w="1835" w:type="dxa"/>
             <w:tcBorders>
               <w:top w:val="single" w:sz="4" w:space="0" w:color="000000"/>
               <w:start w:val="single" w:sz="4" w:space="0" w:color="000000"/>
@@ -8645,7 +8612,7 @@
         </w:tc>
         <w:tc>
           <w:tcPr>
-            <w:tcW w:w="1773" w:type="dxa"/>
+            <w:tcW w:w="1772" w:type="dxa"/>
             <w:tcBorders>
               <w:top w:val="single" w:sz="4" w:space="0" w:color="000000"/>
               <w:bottom w:val="single" w:sz="4" w:space="0" w:color="000000"/>
@@ -8679,7 +8646,7 @@
         </w:tc>
         <w:tc>
           <w:tcPr>
-            <w:tcW w:w="1834" w:type="dxa"/>
+            <w:tcW w:w="1835" w:type="dxa"/>
             <w:tcBorders>
               <w:top w:val="single" w:sz="4" w:space="0" w:color="000000"/>
               <w:bottom w:val="single" w:sz="4" w:space="0" w:color="000000"/>
@@ -8778,8 +8745,8 @@
       <w:tblGrid>
         <w:gridCol w:w="1860"/>
         <w:gridCol w:w="2043"/>
-        <w:gridCol w:w="1449"/>
-        <w:gridCol w:w="4042"/>
+        <w:gridCol w:w="1448"/>
+        <w:gridCol w:w="4043"/>
       </w:tblGrid>
       <w:tr>
         <w:trPr>
@@ -9643,7 +9610,7 @@
         </w:tc>
         <w:tc>
           <w:tcPr>
-            <w:tcW w:w="1449" w:type="dxa"/>
+            <w:tcW w:w="1448" w:type="dxa"/>
             <w:tcBorders>
               <w:bottom w:val="single" w:sz="4" w:space="0" w:color="000000"/>
               <w:end w:val="single" w:sz="4" w:space="0" w:color="000000"/>
@@ -9682,7 +9649,7 @@
         </w:tc>
         <w:tc>
           <w:tcPr>
-            <w:tcW w:w="4042" w:type="dxa"/>
+            <w:tcW w:w="4043" w:type="dxa"/>
             <w:tcBorders>
               <w:bottom w:val="single" w:sz="4" w:space="0" w:color="000000"/>
               <w:end w:val="single" w:sz="4" w:space="0" w:color="000000"/>
@@ -9798,7 +9765,7 @@
         </w:tc>
         <w:tc>
           <w:tcPr>
-            <w:tcW w:w="1449" w:type="dxa"/>
+            <w:tcW w:w="1448" w:type="dxa"/>
             <w:tcBorders>
               <w:bottom w:val="single" w:sz="4" w:space="0" w:color="000000"/>
               <w:end w:val="single" w:sz="4" w:space="0" w:color="000000"/>
@@ -9832,7 +9799,7 @@
         </w:tc>
         <w:tc>
           <w:tcPr>
-            <w:tcW w:w="4042" w:type="dxa"/>
+            <w:tcW w:w="4043" w:type="dxa"/>
             <w:tcBorders>
               <w:bottom w:val="single" w:sz="4" w:space="0" w:color="000000"/>
               <w:end w:val="single" w:sz="4" w:space="0" w:color="000000"/>
@@ -9943,7 +9910,7 @@
         </w:tc>
         <w:tc>
           <w:tcPr>
-            <w:tcW w:w="1449" w:type="dxa"/>
+            <w:tcW w:w="1448" w:type="dxa"/>
             <w:tcBorders>
               <w:bottom w:val="single" w:sz="4" w:space="0" w:color="000000"/>
               <w:end w:val="single" w:sz="4" w:space="0" w:color="000000"/>
@@ -9977,7 +9944,7 @@
         </w:tc>
         <w:tc>
           <w:tcPr>
-            <w:tcW w:w="4042" w:type="dxa"/>
+            <w:tcW w:w="4043" w:type="dxa"/>
             <w:tcBorders>
               <w:bottom w:val="single" w:sz="4" w:space="0" w:color="000000"/>
               <w:end w:val="single" w:sz="4" w:space="0" w:color="000000"/>
@@ -10088,7 +10055,7 @@
         </w:tc>
         <w:tc>
           <w:tcPr>
-            <w:tcW w:w="1449" w:type="dxa"/>
+            <w:tcW w:w="1448" w:type="dxa"/>
             <w:tcBorders>
               <w:bottom w:val="single" w:sz="4" w:space="0" w:color="000000"/>
               <w:end w:val="single" w:sz="4" w:space="0" w:color="000000"/>
@@ -10122,7 +10089,7 @@
         </w:tc>
         <w:tc>
           <w:tcPr>
-            <w:tcW w:w="4042" w:type="dxa"/>
+            <w:tcW w:w="4043" w:type="dxa"/>
             <w:tcBorders>
               <w:bottom w:val="single" w:sz="4" w:space="0" w:color="000000"/>
               <w:end w:val="single" w:sz="4" w:space="0" w:color="000000"/>
@@ -10233,7 +10200,7 @@
         </w:tc>
         <w:tc>
           <w:tcPr>
-            <w:tcW w:w="1449" w:type="dxa"/>
+            <w:tcW w:w="1448" w:type="dxa"/>
             <w:tcBorders>
               <w:bottom w:val="single" w:sz="4" w:space="0" w:color="000000"/>
               <w:end w:val="single" w:sz="4" w:space="0" w:color="000000"/>
@@ -10267,7 +10234,7 @@
         </w:tc>
         <w:tc>
           <w:tcPr>
-            <w:tcW w:w="4042" w:type="dxa"/>
+            <w:tcW w:w="4043" w:type="dxa"/>
             <w:tcBorders>
               <w:bottom w:val="single" w:sz="4" w:space="0" w:color="000000"/>
               <w:end w:val="single" w:sz="4" w:space="0" w:color="000000"/>
@@ -10378,7 +10345,7 @@
         </w:tc>
         <w:tc>
           <w:tcPr>
-            <w:tcW w:w="1449" w:type="dxa"/>
+            <w:tcW w:w="1448" w:type="dxa"/>
             <w:tcBorders>
               <w:bottom w:val="single" w:sz="4" w:space="0" w:color="000000"/>
               <w:end w:val="single" w:sz="4" w:space="0" w:color="000000"/>
@@ -10412,7 +10379,7 @@
         </w:tc>
         <w:tc>
           <w:tcPr>
-            <w:tcW w:w="4042" w:type="dxa"/>
+            <w:tcW w:w="4043" w:type="dxa"/>
             <w:tcBorders>
               <w:bottom w:val="single" w:sz="4" w:space="0" w:color="000000"/>
               <w:end w:val="single" w:sz="4" w:space="0" w:color="000000"/>
@@ -10473,10 +10440,10 @@
         </w:tblCellMar>
       </w:tblPr>
       <w:tblGrid>
-        <w:gridCol w:w="1924"/>
+        <w:gridCol w:w="1923"/>
         <w:gridCol w:w="1954"/>
         <w:gridCol w:w="1568"/>
-        <w:gridCol w:w="3948"/>
+        <w:gridCol w:w="3949"/>
       </w:tblGrid>
       <w:tr>
         <w:trPr>
@@ -10484,7 +10451,7 @@
         </w:trPr>
         <w:tc>
           <w:tcPr>
-            <w:tcW w:w="1924" w:type="dxa"/>
+            <w:tcW w:w="1923" w:type="dxa"/>
             <w:tcBorders>
               <w:top w:val="single" w:sz="4" w:space="0" w:color="000000"/>
               <w:start w:val="single" w:sz="4" w:space="0" w:color="000000"/>
@@ -10519,7 +10486,7 @@
         </w:tc>
         <w:tc>
           <w:tcPr>
-            <w:tcW w:w="7470" w:type="dxa"/>
+            <w:tcW w:w="7471" w:type="dxa"/>
             <w:gridSpan w:val="3"/>
             <w:tcBorders>
               <w:top w:val="single" w:sz="4" w:space="0" w:color="000000"/>
@@ -10563,7 +10530,7 @@
         </w:trPr>
         <w:tc>
           <w:tcPr>
-            <w:tcW w:w="1924" w:type="dxa"/>
+            <w:tcW w:w="1923" w:type="dxa"/>
             <w:tcBorders>
               <w:start w:val="single" w:sz="4" w:space="0" w:color="000000"/>
               <w:bottom w:val="single" w:sz="4" w:space="0" w:color="000000"/>
@@ -10597,7 +10564,7 @@
         </w:tc>
         <w:tc>
           <w:tcPr>
-            <w:tcW w:w="7470" w:type="dxa"/>
+            <w:tcW w:w="7471" w:type="dxa"/>
             <w:gridSpan w:val="3"/>
             <w:tcBorders>
               <w:top w:val="single" w:sz="4" w:space="0" w:color="000000"/>
@@ -10637,7 +10604,7 @@
         </w:trPr>
         <w:tc>
           <w:tcPr>
-            <w:tcW w:w="1924" w:type="dxa"/>
+            <w:tcW w:w="1923" w:type="dxa"/>
             <w:tcBorders>
               <w:start w:val="single" w:sz="4" w:space="0" w:color="000000"/>
               <w:bottom w:val="single" w:sz="4" w:space="0" w:color="000000"/>
@@ -10671,7 +10638,7 @@
         </w:tc>
         <w:tc>
           <w:tcPr>
-            <w:tcW w:w="7470" w:type="dxa"/>
+            <w:tcW w:w="7471" w:type="dxa"/>
             <w:gridSpan w:val="3"/>
             <w:tcBorders>
               <w:top w:val="single" w:sz="4" w:space="0" w:color="000000"/>
@@ -10711,7 +10678,7 @@
         </w:trPr>
         <w:tc>
           <w:tcPr>
-            <w:tcW w:w="1924" w:type="dxa"/>
+            <w:tcW w:w="1923" w:type="dxa"/>
             <w:tcBorders>
               <w:start w:val="single" w:sz="4" w:space="0" w:color="000000"/>
               <w:bottom w:val="single" w:sz="4" w:space="0" w:color="000000"/>
@@ -10745,7 +10712,7 @@
         </w:tc>
         <w:tc>
           <w:tcPr>
-            <w:tcW w:w="7470" w:type="dxa"/>
+            <w:tcW w:w="7471" w:type="dxa"/>
             <w:gridSpan w:val="3"/>
             <w:tcBorders>
               <w:top w:val="single" w:sz="4" w:space="0" w:color="000000"/>
@@ -10785,7 +10752,7 @@
         </w:trPr>
         <w:tc>
           <w:tcPr>
-            <w:tcW w:w="1924" w:type="dxa"/>
+            <w:tcW w:w="1923" w:type="dxa"/>
             <w:tcBorders>
               <w:start w:val="single" w:sz="4" w:space="0" w:color="000000"/>
               <w:bottom w:val="single" w:sz="4" w:space="0" w:color="000000"/>
@@ -10819,7 +10786,7 @@
         </w:tc>
         <w:tc>
           <w:tcPr>
-            <w:tcW w:w="7470" w:type="dxa"/>
+            <w:tcW w:w="7471" w:type="dxa"/>
             <w:gridSpan w:val="3"/>
             <w:tcBorders>
               <w:top w:val="single" w:sz="4" w:space="0" w:color="000000"/>
@@ -10859,7 +10826,7 @@
         </w:trPr>
         <w:tc>
           <w:tcPr>
-            <w:tcW w:w="1924" w:type="dxa"/>
+            <w:tcW w:w="1923" w:type="dxa"/>
             <w:tcBorders>
               <w:start w:val="single" w:sz="4" w:space="0" w:color="000000"/>
               <w:bottom w:val="single" w:sz="4" w:space="0" w:color="000000"/>
@@ -10893,7 +10860,7 @@
         </w:tc>
         <w:tc>
           <w:tcPr>
-            <w:tcW w:w="7470" w:type="dxa"/>
+            <w:tcW w:w="7471" w:type="dxa"/>
             <w:gridSpan w:val="3"/>
             <w:tcBorders>
               <w:top w:val="single" w:sz="4" w:space="0" w:color="000000"/>
@@ -11022,7 +10989,7 @@
         </w:trPr>
         <w:tc>
           <w:tcPr>
-            <w:tcW w:w="3878" w:type="dxa"/>
+            <w:tcW w:w="3877" w:type="dxa"/>
             <w:gridSpan w:val="2"/>
             <w:tcBorders>
               <w:top w:val="single" w:sz="4" w:space="0" w:color="000000"/>
@@ -11062,7 +11029,7 @@
         </w:tc>
         <w:tc>
           <w:tcPr>
-            <w:tcW w:w="5516" w:type="dxa"/>
+            <w:tcW w:w="5517" w:type="dxa"/>
             <w:gridSpan w:val="2"/>
             <w:tcBorders>
               <w:top w:val="single" w:sz="4" w:space="0" w:color="000000"/>
@@ -11102,7 +11069,7 @@
         </w:trPr>
         <w:tc>
           <w:tcPr>
-            <w:tcW w:w="3878" w:type="dxa"/>
+            <w:tcW w:w="3877" w:type="dxa"/>
             <w:gridSpan w:val="2"/>
             <w:tcBorders>
               <w:top w:val="single" w:sz="4" w:space="0" w:color="000000"/>
@@ -11142,7 +11109,7 @@
         </w:tc>
         <w:tc>
           <w:tcPr>
-            <w:tcW w:w="5516" w:type="dxa"/>
+            <w:tcW w:w="5517" w:type="dxa"/>
             <w:gridSpan w:val="2"/>
             <w:tcBorders>
               <w:top w:val="single" w:sz="4" w:space="0" w:color="000000"/>
@@ -11182,7 +11149,7 @@
         </w:trPr>
         <w:tc>
           <w:tcPr>
-            <w:tcW w:w="3878" w:type="dxa"/>
+            <w:tcW w:w="3877" w:type="dxa"/>
             <w:gridSpan w:val="2"/>
             <w:tcBorders>
               <w:top w:val="single" w:sz="4" w:space="0" w:color="000000"/>
@@ -11222,7 +11189,7 @@
         </w:tc>
         <w:tc>
           <w:tcPr>
-            <w:tcW w:w="5516" w:type="dxa"/>
+            <w:tcW w:w="5517" w:type="dxa"/>
             <w:gridSpan w:val="2"/>
             <w:tcBorders>
               <w:top w:val="single" w:sz="4" w:space="0" w:color="000000"/>
@@ -11262,7 +11229,7 @@
         </w:trPr>
         <w:tc>
           <w:tcPr>
-            <w:tcW w:w="1924" w:type="dxa"/>
+            <w:tcW w:w="1923" w:type="dxa"/>
             <w:tcBorders>
               <w:start w:val="single" w:sz="4" w:space="0" w:color="000000"/>
               <w:bottom w:val="single" w:sz="4" w:space="0" w:color="000000"/>
@@ -11379,7 +11346,7 @@
         </w:tc>
         <w:tc>
           <w:tcPr>
-            <w:tcW w:w="3948" w:type="dxa"/>
+            <w:tcW w:w="3949" w:type="dxa"/>
             <w:tcBorders>
               <w:bottom w:val="single" w:sz="4" w:space="0" w:color="000000"/>
               <w:end w:val="single" w:sz="4" w:space="0" w:color="000000"/>
@@ -11423,7 +11390,7 @@
         </w:trPr>
         <w:tc>
           <w:tcPr>
-            <w:tcW w:w="1924" w:type="dxa"/>
+            <w:tcW w:w="1923" w:type="dxa"/>
             <w:tcBorders>
               <w:start w:val="single" w:sz="4" w:space="0" w:color="000000"/>
               <w:bottom w:val="single" w:sz="4" w:space="0" w:color="000000"/>
@@ -11529,7 +11496,7 @@
         </w:tc>
         <w:tc>
           <w:tcPr>
-            <w:tcW w:w="3948" w:type="dxa"/>
+            <w:tcW w:w="3949" w:type="dxa"/>
             <w:tcBorders>
               <w:bottom w:val="single" w:sz="4" w:space="0" w:color="000000"/>
               <w:end w:val="single" w:sz="4" w:space="0" w:color="000000"/>
@@ -11568,7 +11535,7 @@
         </w:trPr>
         <w:tc>
           <w:tcPr>
-            <w:tcW w:w="1924" w:type="dxa"/>
+            <w:tcW w:w="1923" w:type="dxa"/>
             <w:tcBorders>
               <w:start w:val="single" w:sz="4" w:space="0" w:color="000000"/>
               <w:bottom w:val="single" w:sz="4" w:space="0" w:color="000000"/>
@@ -11674,7 +11641,7 @@
         </w:tc>
         <w:tc>
           <w:tcPr>
-            <w:tcW w:w="3948" w:type="dxa"/>
+            <w:tcW w:w="3949" w:type="dxa"/>
             <w:tcBorders>
               <w:bottom w:val="single" w:sz="4" w:space="0" w:color="000000"/>
               <w:end w:val="single" w:sz="4" w:space="0" w:color="000000"/>
@@ -11713,7 +11680,7 @@
         </w:trPr>
         <w:tc>
           <w:tcPr>
-            <w:tcW w:w="1924" w:type="dxa"/>
+            <w:tcW w:w="1923" w:type="dxa"/>
             <w:tcBorders>
               <w:start w:val="single" w:sz="4" w:space="0" w:color="000000"/>
               <w:bottom w:val="single" w:sz="4" w:space="0" w:color="000000"/>
@@ -11819,7 +11786,7 @@
         </w:tc>
         <w:tc>
           <w:tcPr>
-            <w:tcW w:w="3948" w:type="dxa"/>
+            <w:tcW w:w="3949" w:type="dxa"/>
             <w:tcBorders>
               <w:bottom w:val="single" w:sz="4" w:space="0" w:color="000000"/>
               <w:end w:val="single" w:sz="4" w:space="0" w:color="000000"/>
@@ -11882,8 +11849,8 @@
       <w:tblGrid>
         <w:gridCol w:w="2055"/>
         <w:gridCol w:w="2187"/>
-        <w:gridCol w:w="1250"/>
-        <w:gridCol w:w="3902"/>
+        <w:gridCol w:w="1249"/>
+        <w:gridCol w:w="3903"/>
       </w:tblGrid>
       <w:tr>
         <w:trPr>
@@ -12745,7 +12712,7 @@
         </w:tc>
         <w:tc>
           <w:tcPr>
-            <w:tcW w:w="1250" w:type="dxa"/>
+            <w:tcW w:w="1249" w:type="dxa"/>
             <w:tcBorders>
               <w:bottom w:val="single" w:sz="4" w:space="0" w:color="000000"/>
               <w:end w:val="single" w:sz="4" w:space="0" w:color="000000"/>
@@ -12784,7 +12751,7 @@
         </w:tc>
         <w:tc>
           <w:tcPr>
-            <w:tcW w:w="3902" w:type="dxa"/>
+            <w:tcW w:w="3903" w:type="dxa"/>
             <w:tcBorders>
               <w:bottom w:val="single" w:sz="4" w:space="0" w:color="000000"/>
               <w:end w:val="single" w:sz="4" w:space="0" w:color="000000"/>
@@ -12901,7 +12868,7 @@
         </w:tc>
         <w:tc>
           <w:tcPr>
-            <w:tcW w:w="1250" w:type="dxa"/>
+            <w:tcW w:w="1249" w:type="dxa"/>
             <w:tcBorders>
               <w:bottom w:val="single" w:sz="4" w:space="0" w:color="000000"/>
               <w:end w:val="single" w:sz="4" w:space="0" w:color="000000"/>
@@ -12935,7 +12902,7 @@
         </w:tc>
         <w:tc>
           <w:tcPr>
-            <w:tcW w:w="3902" w:type="dxa"/>
+            <w:tcW w:w="3903" w:type="dxa"/>
             <w:tcBorders>
               <w:bottom w:val="single" w:sz="4" w:space="0" w:color="000000"/>
               <w:end w:val="single" w:sz="4" w:space="0" w:color="000000"/>
@@ -13047,7 +13014,7 @@
         </w:tc>
         <w:tc>
           <w:tcPr>
-            <w:tcW w:w="1250" w:type="dxa"/>
+            <w:tcW w:w="1249" w:type="dxa"/>
             <w:tcBorders>
               <w:bottom w:val="single" w:sz="4" w:space="0" w:color="000000"/>
               <w:end w:val="single" w:sz="4" w:space="0" w:color="000000"/>
@@ -13081,7 +13048,7 @@
         </w:tc>
         <w:tc>
           <w:tcPr>
-            <w:tcW w:w="3902" w:type="dxa"/>
+            <w:tcW w:w="3903" w:type="dxa"/>
             <w:tcBorders>
               <w:bottom w:val="single" w:sz="4" w:space="0" w:color="000000"/>
               <w:end w:val="single" w:sz="4" w:space="0" w:color="000000"/>
@@ -13193,7 +13160,7 @@
         </w:tc>
         <w:tc>
           <w:tcPr>
-            <w:tcW w:w="1250" w:type="dxa"/>
+            <w:tcW w:w="1249" w:type="dxa"/>
             <w:tcBorders>
               <w:bottom w:val="single" w:sz="4" w:space="0" w:color="000000"/>
               <w:end w:val="single" w:sz="4" w:space="0" w:color="000000"/>
@@ -13227,7 +13194,7 @@
         </w:tc>
         <w:tc>
           <w:tcPr>
-            <w:tcW w:w="3902" w:type="dxa"/>
+            <w:tcW w:w="3903" w:type="dxa"/>
             <w:tcBorders>
               <w:bottom w:val="single" w:sz="4" w:space="0" w:color="000000"/>
               <w:end w:val="single" w:sz="4" w:space="0" w:color="000000"/>
@@ -13289,8 +13256,8 @@
       </w:tblPr>
       <w:tblGrid>
         <w:gridCol w:w="1812"/>
-        <w:gridCol w:w="1911"/>
-        <w:gridCol w:w="1966"/>
+        <w:gridCol w:w="1910"/>
+        <w:gridCol w:w="1967"/>
         <w:gridCol w:w="3705"/>
       </w:tblGrid>
       <w:tr>
@@ -13840,7 +13807,7 @@
         </w:trPr>
         <w:tc>
           <w:tcPr>
-            <w:tcW w:w="3723" w:type="dxa"/>
+            <w:tcW w:w="3722" w:type="dxa"/>
             <w:gridSpan w:val="2"/>
             <w:tcBorders>
               <w:top w:val="single" w:sz="4" w:space="0" w:color="000000"/>
@@ -13880,7 +13847,7 @@
         </w:tc>
         <w:tc>
           <w:tcPr>
-            <w:tcW w:w="5671" w:type="dxa"/>
+            <w:tcW w:w="5672" w:type="dxa"/>
             <w:gridSpan w:val="2"/>
             <w:tcBorders>
               <w:top w:val="single" w:sz="4" w:space="0" w:color="000000"/>
@@ -13920,7 +13887,7 @@
         </w:trPr>
         <w:tc>
           <w:tcPr>
-            <w:tcW w:w="3723" w:type="dxa"/>
+            <w:tcW w:w="3722" w:type="dxa"/>
             <w:gridSpan w:val="2"/>
             <w:tcBorders>
               <w:top w:val="single" w:sz="4" w:space="0" w:color="000000"/>
@@ -13960,7 +13927,7 @@
         </w:tc>
         <w:tc>
           <w:tcPr>
-            <w:tcW w:w="5671" w:type="dxa"/>
+            <w:tcW w:w="5672" w:type="dxa"/>
             <w:gridSpan w:val="2"/>
             <w:tcBorders>
               <w:top w:val="single" w:sz="4" w:space="0" w:color="000000"/>
@@ -14000,7 +13967,7 @@
         </w:trPr>
         <w:tc>
           <w:tcPr>
-            <w:tcW w:w="3723" w:type="dxa"/>
+            <w:tcW w:w="3722" w:type="dxa"/>
             <w:gridSpan w:val="2"/>
             <w:tcBorders>
               <w:top w:val="single" w:sz="4" w:space="0" w:color="000000"/>
@@ -14040,7 +14007,7 @@
         </w:tc>
         <w:tc>
           <w:tcPr>
-            <w:tcW w:w="5671" w:type="dxa"/>
+            <w:tcW w:w="5672" w:type="dxa"/>
             <w:gridSpan w:val="2"/>
             <w:tcBorders>
               <w:top w:val="single" w:sz="4" w:space="0" w:color="000000"/>
@@ -14120,7 +14087,7 @@
         </w:tc>
         <w:tc>
           <w:tcPr>
-            <w:tcW w:w="1911" w:type="dxa"/>
+            <w:tcW w:w="1910" w:type="dxa"/>
             <w:tcBorders>
               <w:bottom w:val="single" w:sz="4" w:space="0" w:color="000000"/>
               <w:end w:val="single" w:sz="4" w:space="0" w:color="000000"/>
@@ -14158,7 +14125,7 @@
         </w:tc>
         <w:tc>
           <w:tcPr>
-            <w:tcW w:w="1966" w:type="dxa"/>
+            <w:tcW w:w="1967" w:type="dxa"/>
             <w:tcBorders>
               <w:bottom w:val="single" w:sz="4" w:space="0" w:color="000000"/>
               <w:end w:val="single" w:sz="4" w:space="0" w:color="000000"/>
@@ -14280,7 +14247,7 @@
         </w:tc>
         <w:tc>
           <w:tcPr>
-            <w:tcW w:w="1911" w:type="dxa"/>
+            <w:tcW w:w="1910" w:type="dxa"/>
             <w:tcBorders>
               <w:bottom w:val="single" w:sz="4" w:space="0" w:color="000000"/>
               <w:end w:val="single" w:sz="4" w:space="0" w:color="000000"/>
@@ -14313,7 +14280,7 @@
         </w:tc>
         <w:tc>
           <w:tcPr>
-            <w:tcW w:w="1966" w:type="dxa"/>
+            <w:tcW w:w="1967" w:type="dxa"/>
             <w:tcBorders>
               <w:bottom w:val="single" w:sz="4" w:space="0" w:color="000000"/>
               <w:end w:val="single" w:sz="4" w:space="0" w:color="000000"/>
@@ -14425,7 +14392,7 @@
         </w:tc>
         <w:tc>
           <w:tcPr>
-            <w:tcW w:w="1911" w:type="dxa"/>
+            <w:tcW w:w="1910" w:type="dxa"/>
             <w:tcBorders>
               <w:bottom w:val="single" w:sz="4" w:space="0" w:color="000000"/>
               <w:end w:val="single" w:sz="4" w:space="0" w:color="000000"/>
@@ -14458,7 +14425,7 @@
         </w:tc>
         <w:tc>
           <w:tcPr>
-            <w:tcW w:w="1966" w:type="dxa"/>
+            <w:tcW w:w="1967" w:type="dxa"/>
             <w:tcBorders>
               <w:bottom w:val="single" w:sz="4" w:space="0" w:color="000000"/>
               <w:end w:val="single" w:sz="4" w:space="0" w:color="000000"/>
@@ -14570,7 +14537,7 @@
         </w:tc>
         <w:tc>
           <w:tcPr>
-            <w:tcW w:w="1911" w:type="dxa"/>
+            <w:tcW w:w="1910" w:type="dxa"/>
             <w:tcBorders>
               <w:bottom w:val="single" w:sz="4" w:space="0" w:color="000000"/>
               <w:end w:val="single" w:sz="4" w:space="0" w:color="000000"/>
@@ -14603,7 +14570,7 @@
         </w:tc>
         <w:tc>
           <w:tcPr>
-            <w:tcW w:w="1966" w:type="dxa"/>
+            <w:tcW w:w="1967" w:type="dxa"/>
             <w:tcBorders>
               <w:bottom w:val="single" w:sz="4" w:space="0" w:color="000000"/>
               <w:end w:val="single" w:sz="4" w:space="0" w:color="000000"/>
@@ -14715,7 +14682,7 @@
         </w:tc>
         <w:tc>
           <w:tcPr>
-            <w:tcW w:w="1911" w:type="dxa"/>
+            <w:tcW w:w="1910" w:type="dxa"/>
             <w:tcBorders>
               <w:bottom w:val="single" w:sz="4" w:space="0" w:color="000000"/>
               <w:end w:val="single" w:sz="4" w:space="0" w:color="000000"/>
@@ -14748,7 +14715,7 @@
         </w:tc>
         <w:tc>
           <w:tcPr>
-            <w:tcW w:w="1966" w:type="dxa"/>
+            <w:tcW w:w="1967" w:type="dxa"/>
             <w:tcBorders>
               <w:bottom w:val="single" w:sz="4" w:space="0" w:color="000000"/>
               <w:end w:val="single" w:sz="4" w:space="0" w:color="000000"/>
@@ -14861,7 +14828,7 @@
         </w:tc>
         <w:tc>
           <w:tcPr>
-            <w:tcW w:w="1911" w:type="dxa"/>
+            <w:tcW w:w="1910" w:type="dxa"/>
             <w:tcBorders>
               <w:top w:val="single" w:sz="4" w:space="0" w:color="000000"/>
               <w:start w:val="single" w:sz="4" w:space="0" w:color="000000"/>
@@ -14896,7 +14863,7 @@
         </w:tc>
         <w:tc>
           <w:tcPr>
-            <w:tcW w:w="1966" w:type="dxa"/>
+            <w:tcW w:w="1967" w:type="dxa"/>
             <w:tcBorders>
               <w:top w:val="single" w:sz="4" w:space="0" w:color="000000"/>
               <w:start w:val="single" w:sz="4" w:space="0" w:color="000000"/>
@@ -15013,7 +14980,7 @@
         </w:tc>
         <w:tc>
           <w:tcPr>
-            <w:tcW w:w="1911" w:type="dxa"/>
+            <w:tcW w:w="1910" w:type="dxa"/>
             <w:tcBorders>
               <w:top w:val="single" w:sz="4" w:space="0" w:color="000000"/>
               <w:bottom w:val="single" w:sz="4" w:space="0" w:color="000000"/>
@@ -15047,7 +15014,7 @@
         </w:tc>
         <w:tc>
           <w:tcPr>
-            <w:tcW w:w="1966" w:type="dxa"/>
+            <w:tcW w:w="1967" w:type="dxa"/>
             <w:tcBorders>
               <w:top w:val="single" w:sz="4" w:space="0" w:color="000000"/>
               <w:bottom w:val="single" w:sz="4" w:space="0" w:color="000000"/>
@@ -15161,7 +15128,7 @@
         </w:tc>
         <w:tc>
           <w:tcPr>
-            <w:tcW w:w="1911" w:type="dxa"/>
+            <w:tcW w:w="1910" w:type="dxa"/>
             <w:tcBorders>
               <w:bottom w:val="single" w:sz="4" w:space="0" w:color="000000"/>
               <w:end w:val="single" w:sz="4" w:space="0" w:color="000000"/>
@@ -15194,7 +15161,7 @@
         </w:tc>
         <w:tc>
           <w:tcPr>
-            <w:tcW w:w="1966" w:type="dxa"/>
+            <w:tcW w:w="1967" w:type="dxa"/>
             <w:tcBorders>
               <w:bottom w:val="single" w:sz="4" w:space="0" w:color="000000"/>
               <w:end w:val="single" w:sz="4" w:space="0" w:color="000000"/>
@@ -15290,8 +15257,8 @@
       </w:tblPr>
       <w:tblGrid>
         <w:gridCol w:w="1981"/>
-        <w:gridCol w:w="1818"/>
-        <w:gridCol w:w="1884"/>
+        <w:gridCol w:w="1817"/>
+        <w:gridCol w:w="1885"/>
         <w:gridCol w:w="3711"/>
       </w:tblGrid>
       <w:tr>
@@ -15841,7 +15808,7 @@
         </w:trPr>
         <w:tc>
           <w:tcPr>
-            <w:tcW w:w="3799" w:type="dxa"/>
+            <w:tcW w:w="3798" w:type="dxa"/>
             <w:gridSpan w:val="2"/>
             <w:tcBorders>
               <w:top w:val="single" w:sz="4" w:space="0" w:color="000000"/>
@@ -15881,7 +15848,7 @@
         </w:tc>
         <w:tc>
           <w:tcPr>
-            <w:tcW w:w="5595" w:type="dxa"/>
+            <w:tcW w:w="5596" w:type="dxa"/>
             <w:gridSpan w:val="2"/>
             <w:tcBorders>
               <w:top w:val="single" w:sz="4" w:space="0" w:color="000000"/>
@@ -15921,7 +15888,7 @@
         </w:trPr>
         <w:tc>
           <w:tcPr>
-            <w:tcW w:w="3799" w:type="dxa"/>
+            <w:tcW w:w="3798" w:type="dxa"/>
             <w:gridSpan w:val="2"/>
             <w:tcBorders>
               <w:top w:val="single" w:sz="4" w:space="0" w:color="000000"/>
@@ -15961,7 +15928,7 @@
         </w:tc>
         <w:tc>
           <w:tcPr>
-            <w:tcW w:w="5595" w:type="dxa"/>
+            <w:tcW w:w="5596" w:type="dxa"/>
             <w:gridSpan w:val="2"/>
             <w:tcBorders>
               <w:top w:val="single" w:sz="4" w:space="0" w:color="000000"/>
@@ -16001,7 +15968,7 @@
         </w:trPr>
         <w:tc>
           <w:tcPr>
-            <w:tcW w:w="3799" w:type="dxa"/>
+            <w:tcW w:w="3798" w:type="dxa"/>
             <w:gridSpan w:val="2"/>
             <w:tcBorders>
               <w:top w:val="single" w:sz="4" w:space="0" w:color="000000"/>
@@ -16041,7 +16008,7 @@
         </w:tc>
         <w:tc>
           <w:tcPr>
-            <w:tcW w:w="5595" w:type="dxa"/>
+            <w:tcW w:w="5596" w:type="dxa"/>
             <w:gridSpan w:val="2"/>
             <w:tcBorders>
               <w:top w:val="single" w:sz="4" w:space="0" w:color="000000"/>
@@ -16120,7 +16087,7 @@
         </w:tc>
         <w:tc>
           <w:tcPr>
-            <w:tcW w:w="1818" w:type="dxa"/>
+            <w:tcW w:w="1817" w:type="dxa"/>
             <w:tcBorders/>
             <w:shd w:fill="002060" w:val="clear"/>
             <w:vAlign w:val="center"/>
@@ -16155,7 +16122,7 @@
         </w:tc>
         <w:tc>
           <w:tcPr>
-            <w:tcW w:w="1884" w:type="dxa"/>
+            <w:tcW w:w="1885" w:type="dxa"/>
             <w:tcBorders>
               <w:end w:val="single" w:sz="8" w:space="0" w:color="000000"/>
             </w:tcBorders>
@@ -16275,7 +16242,7 @@
         </w:tc>
         <w:tc>
           <w:tcPr>
-            <w:tcW w:w="1818" w:type="dxa"/>
+            <w:tcW w:w="1817" w:type="dxa"/>
             <w:tcBorders>
               <w:top w:val="single" w:sz="4" w:space="0" w:color="000000"/>
               <w:bottom w:val="single" w:sz="4" w:space="0" w:color="000000"/>
@@ -16309,7 +16276,7 @@
         </w:tc>
         <w:tc>
           <w:tcPr>
-            <w:tcW w:w="1884" w:type="dxa"/>
+            <w:tcW w:w="1885" w:type="dxa"/>
             <w:tcBorders>
               <w:top w:val="single" w:sz="4" w:space="0" w:color="000000"/>
               <w:bottom w:val="single" w:sz="4" w:space="0" w:color="000000"/>
@@ -16422,7 +16389,7 @@
         </w:tc>
         <w:tc>
           <w:tcPr>
-            <w:tcW w:w="1818" w:type="dxa"/>
+            <w:tcW w:w="1817" w:type="dxa"/>
             <w:tcBorders>
               <w:bottom w:val="single" w:sz="4" w:space="0" w:color="000000"/>
               <w:end w:val="single" w:sz="4" w:space="0" w:color="000000"/>
@@ -16455,7 +16422,7 @@
         </w:tc>
         <w:tc>
           <w:tcPr>
-            <w:tcW w:w="1884" w:type="dxa"/>
+            <w:tcW w:w="1885" w:type="dxa"/>
             <w:tcBorders>
               <w:bottom w:val="single" w:sz="4" w:space="0" w:color="000000"/>
               <w:end w:val="single" w:sz="4" w:space="0" w:color="000000"/>
@@ -16567,7 +16534,7 @@
         </w:tc>
         <w:tc>
           <w:tcPr>
-            <w:tcW w:w="1818" w:type="dxa"/>
+            <w:tcW w:w="1817" w:type="dxa"/>
             <w:tcBorders>
               <w:bottom w:val="single" w:sz="4" w:space="0" w:color="000000"/>
               <w:end w:val="single" w:sz="4" w:space="0" w:color="000000"/>
@@ -16600,7 +16567,7 @@
         </w:tc>
         <w:tc>
           <w:tcPr>
-            <w:tcW w:w="1884" w:type="dxa"/>
+            <w:tcW w:w="1885" w:type="dxa"/>
             <w:tcBorders>
               <w:bottom w:val="single" w:sz="4" w:space="0" w:color="000000"/>
               <w:end w:val="single" w:sz="4" w:space="0" w:color="000000"/>
@@ -16749,8 +16716,8 @@
       </w:tblPr>
       <w:tblGrid>
         <w:gridCol w:w="380"/>
-        <w:gridCol w:w="2104"/>
-        <w:gridCol w:w="1449"/>
+        <w:gridCol w:w="2103"/>
+        <w:gridCol w:w="1450"/>
         <w:gridCol w:w="1688"/>
         <w:gridCol w:w="3773"/>
       </w:tblGrid>
@@ -16801,7 +16768,7 @@
         </w:tc>
         <w:tc>
           <w:tcPr>
-            <w:tcW w:w="2104" w:type="dxa"/>
+            <w:tcW w:w="2103" w:type="dxa"/>
             <w:tcBorders>
               <w:top w:val="single" w:sz="4" w:space="0" w:color="000000"/>
               <w:bottom w:val="single" w:sz="4" w:space="0" w:color="000000"/>
@@ -16841,7 +16808,7 @@
         </w:tc>
         <w:tc>
           <w:tcPr>
-            <w:tcW w:w="1449" w:type="dxa"/>
+            <w:tcW w:w="1450" w:type="dxa"/>
             <w:tcBorders>
               <w:top w:val="single" w:sz="4" w:space="0" w:color="000000"/>
               <w:bottom w:val="single" w:sz="4" w:space="0" w:color="000000"/>
@@ -17005,7 +16972,7 @@
         </w:tc>
         <w:tc>
           <w:tcPr>
-            <w:tcW w:w="2104" w:type="dxa"/>
+            <w:tcW w:w="2103" w:type="dxa"/>
             <w:tcBorders>
               <w:bottom w:val="single" w:sz="4" w:space="0" w:color="000000"/>
               <w:end w:val="single" w:sz="4" w:space="0" w:color="000000"/>
@@ -17039,7 +17006,7 @@
         </w:tc>
         <w:tc>
           <w:tcPr>
-            <w:tcW w:w="1449" w:type="dxa"/>
+            <w:tcW w:w="1450" w:type="dxa"/>
             <w:tcBorders>
               <w:bottom w:val="single" w:sz="4" w:space="0" w:color="000000"/>
               <w:end w:val="single" w:sz="4" w:space="0" w:color="000000"/>
@@ -17185,7 +17152,7 @@
         </w:tc>
         <w:tc>
           <w:tcPr>
-            <w:tcW w:w="2104" w:type="dxa"/>
+            <w:tcW w:w="2103" w:type="dxa"/>
             <w:tcBorders>
               <w:bottom w:val="single" w:sz="4" w:space="0" w:color="000000"/>
               <w:end w:val="single" w:sz="4" w:space="0" w:color="000000"/>
@@ -17219,7 +17186,7 @@
         </w:tc>
         <w:tc>
           <w:tcPr>
-            <w:tcW w:w="1449" w:type="dxa"/>
+            <w:tcW w:w="1450" w:type="dxa"/>
             <w:tcBorders>
               <w:bottom w:val="single" w:sz="4" w:space="0" w:color="000000"/>
               <w:end w:val="single" w:sz="4" w:space="0" w:color="000000"/>
@@ -17365,7 +17332,7 @@
         </w:tc>
         <w:tc>
           <w:tcPr>
-            <w:tcW w:w="2104" w:type="dxa"/>
+            <w:tcW w:w="2103" w:type="dxa"/>
             <w:tcBorders>
               <w:bottom w:val="single" w:sz="4" w:space="0" w:color="000000"/>
               <w:end w:val="single" w:sz="4" w:space="0" w:color="000000"/>
@@ -17399,7 +17366,7 @@
         </w:tc>
         <w:tc>
           <w:tcPr>
-            <w:tcW w:w="1449" w:type="dxa"/>
+            <w:tcW w:w="1450" w:type="dxa"/>
             <w:tcBorders>
               <w:bottom w:val="single" w:sz="4" w:space="0" w:color="000000"/>
               <w:end w:val="single" w:sz="4" w:space="0" w:color="000000"/>
@@ -17545,7 +17512,7 @@
         </w:tc>
         <w:tc>
           <w:tcPr>
-            <w:tcW w:w="2104" w:type="dxa"/>
+            <w:tcW w:w="2103" w:type="dxa"/>
             <w:tcBorders>
               <w:bottom w:val="single" w:sz="4" w:space="0" w:color="000000"/>
               <w:end w:val="single" w:sz="4" w:space="0" w:color="000000"/>
@@ -17579,7 +17546,7 @@
         </w:tc>
         <w:tc>
           <w:tcPr>
-            <w:tcW w:w="1449" w:type="dxa"/>
+            <w:tcW w:w="1450" w:type="dxa"/>
             <w:tcBorders>
               <w:bottom w:val="single" w:sz="4" w:space="0" w:color="000000"/>
               <w:end w:val="single" w:sz="4" w:space="0" w:color="000000"/>
@@ -17725,7 +17692,7 @@
         </w:tc>
         <w:tc>
           <w:tcPr>
-            <w:tcW w:w="2104" w:type="dxa"/>
+            <w:tcW w:w="2103" w:type="dxa"/>
             <w:tcBorders>
               <w:bottom w:val="single" w:sz="4" w:space="0" w:color="000000"/>
               <w:end w:val="single" w:sz="4" w:space="0" w:color="000000"/>
@@ -17759,7 +17726,7 @@
         </w:tc>
         <w:tc>
           <w:tcPr>
-            <w:tcW w:w="1449" w:type="dxa"/>
+            <w:tcW w:w="1450" w:type="dxa"/>
             <w:tcBorders>
               <w:bottom w:val="single" w:sz="4" w:space="0" w:color="000000"/>
               <w:end w:val="single" w:sz="4" w:space="0" w:color="000000"/>
@@ -17905,7 +17872,7 @@
         </w:tc>
         <w:tc>
           <w:tcPr>
-            <w:tcW w:w="2104" w:type="dxa"/>
+            <w:tcW w:w="2103" w:type="dxa"/>
             <w:tcBorders>
               <w:bottom w:val="single" w:sz="4" w:space="0" w:color="000000"/>
               <w:end w:val="single" w:sz="4" w:space="0" w:color="000000"/>
@@ -17939,7 +17906,7 @@
         </w:tc>
         <w:tc>
           <w:tcPr>
-            <w:tcW w:w="1449" w:type="dxa"/>
+            <w:tcW w:w="1450" w:type="dxa"/>
             <w:tcBorders>
               <w:bottom w:val="single" w:sz="4" w:space="0" w:color="000000"/>
               <w:end w:val="single" w:sz="4" w:space="0" w:color="000000"/>
@@ -18085,7 +18052,7 @@
         </w:tc>
         <w:tc>
           <w:tcPr>
-            <w:tcW w:w="2104" w:type="dxa"/>
+            <w:tcW w:w="2103" w:type="dxa"/>
             <w:tcBorders>
               <w:bottom w:val="single" w:sz="4" w:space="0" w:color="000000"/>
               <w:end w:val="single" w:sz="4" w:space="0" w:color="000000"/>
@@ -18119,7 +18086,7 @@
         </w:tc>
         <w:tc>
           <w:tcPr>
-            <w:tcW w:w="1449" w:type="dxa"/>
+            <w:tcW w:w="1450" w:type="dxa"/>
             <w:tcBorders>
               <w:bottom w:val="single" w:sz="4" w:space="0" w:color="000000"/>
               <w:end w:val="single" w:sz="4" w:space="0" w:color="000000"/>
@@ -18265,7 +18232,7 @@
         </w:tc>
         <w:tc>
           <w:tcPr>
-            <w:tcW w:w="2104" w:type="dxa"/>
+            <w:tcW w:w="2103" w:type="dxa"/>
             <w:tcBorders>
               <w:bottom w:val="single" w:sz="4" w:space="0" w:color="000000"/>
               <w:end w:val="single" w:sz="4" w:space="0" w:color="000000"/>
@@ -18299,7 +18266,7 @@
         </w:tc>
         <w:tc>
           <w:tcPr>
-            <w:tcW w:w="1449" w:type="dxa"/>
+            <w:tcW w:w="1450" w:type="dxa"/>
             <w:tcBorders>
               <w:bottom w:val="single" w:sz="4" w:space="0" w:color="000000"/>
               <w:end w:val="single" w:sz="4" w:space="0" w:color="000000"/>
@@ -18445,7 +18412,7 @@
         </w:tc>
         <w:tc>
           <w:tcPr>
-            <w:tcW w:w="2104" w:type="dxa"/>
+            <w:tcW w:w="2103" w:type="dxa"/>
             <w:tcBorders>
               <w:bottom w:val="single" w:sz="4" w:space="0" w:color="000000"/>
               <w:end w:val="single" w:sz="4" w:space="0" w:color="000000"/>
@@ -18479,7 +18446,7 @@
         </w:tc>
         <w:tc>
           <w:tcPr>
-            <w:tcW w:w="1449" w:type="dxa"/>
+            <w:tcW w:w="1450" w:type="dxa"/>
             <w:tcBorders>
               <w:bottom w:val="single" w:sz="4" w:space="0" w:color="000000"/>
               <w:end w:val="single" w:sz="4" w:space="0" w:color="000000"/>
@@ -18649,7 +18616,7 @@
     </w:p>
     <w:tbl>
       <w:tblPr>
-        <w:tblW w:w="9394" w:type="dxa"/>
+        <w:tblW w:w="9390" w:type="dxa"/>
         <w:jc w:val="start"/>
         <w:tblInd w:w="0" w:type="dxa"/>
         <w:tblLayout w:type="fixed"/>
@@ -18662,10 +18629,10 @@
       </w:tblPr>
       <w:tblGrid>
         <w:gridCol w:w="817"/>
-        <w:gridCol w:w="2284"/>
+        <w:gridCol w:w="2283"/>
         <w:gridCol w:w="3272"/>
-        <w:gridCol w:w="2875"/>
-        <w:gridCol w:w="146"/>
+        <w:gridCol w:w="2978"/>
+        <w:gridCol w:w="40"/>
       </w:tblGrid>
       <w:tr>
         <w:trPr>
@@ -18714,7 +18681,7 @@
         </w:tc>
         <w:tc>
           <w:tcPr>
-            <w:tcW w:w="2284" w:type="dxa"/>
+            <w:tcW w:w="2283" w:type="dxa"/>
             <w:tcBorders>
               <w:top w:val="single" w:sz="4" w:space="0" w:color="000000"/>
               <w:bottom w:val="single" w:sz="4" w:space="0" w:color="000000"/>
@@ -18794,7 +18761,7 @@
         </w:tc>
         <w:tc>
           <w:tcPr>
-            <w:tcW w:w="2875" w:type="dxa"/>
+            <w:tcW w:w="2978" w:type="dxa"/>
             <w:tcBorders>
               <w:top w:val="single" w:sz="4" w:space="0" w:color="000000"/>
               <w:bottom w:val="single" w:sz="4" w:space="0" w:color="000000"/>
@@ -18860,7 +18827,7 @@
         </w:tc>
         <w:tc>
           <w:tcPr>
-            <w:tcW w:w="146" w:type="dxa"/>
+            <w:tcW w:w="40" w:type="dxa"/>
             <w:tcBorders/>
           </w:tcPr>
           <w:p>
@@ -18925,7 +18892,7 @@
         </w:tc>
         <w:tc>
           <w:tcPr>
-            <w:tcW w:w="2284" w:type="dxa"/>
+            <w:tcW w:w="2283" w:type="dxa"/>
             <w:vMerge w:val="restart"/>
             <w:tcBorders>
               <w:start w:val="single" w:sz="4" w:space="0" w:color="000000"/>
@@ -18997,7 +18964,7 @@
         </w:tc>
         <w:tc>
           <w:tcPr>
-            <w:tcW w:w="2875" w:type="dxa"/>
+            <w:tcW w:w="2978" w:type="dxa"/>
             <w:vMerge w:val="restart"/>
             <w:tcBorders>
               <w:start w:val="single" w:sz="4" w:space="0" w:color="000000"/>
@@ -19033,7 +19000,7 @@
         </w:tc>
         <w:tc>
           <w:tcPr>
-            <w:tcW w:w="146" w:type="dxa"/>
+            <w:tcW w:w="40" w:type="dxa"/>
             <w:tcBorders/>
           </w:tcPr>
           <w:p>
@@ -19083,7 +19050,7 @@
         </w:tc>
         <w:tc>
           <w:tcPr>
-            <w:tcW w:w="2284" w:type="dxa"/>
+            <w:tcW w:w="2283" w:type="dxa"/>
             <w:vMerge w:val="continue"/>
             <w:tcBorders>
               <w:start w:val="single" w:sz="4" w:space="0" w:color="000000"/>
@@ -19133,7 +19100,7 @@
         </w:tc>
         <w:tc>
           <w:tcPr>
-            <w:tcW w:w="2875" w:type="dxa"/>
+            <w:tcW w:w="2978" w:type="dxa"/>
             <w:vMerge w:val="continue"/>
             <w:tcBorders>
               <w:start w:val="single" w:sz="4" w:space="0" w:color="000000"/>
@@ -19158,7 +19125,7 @@
         </w:tc>
         <w:tc>
           <w:tcPr>
-            <w:tcW w:w="146" w:type="dxa"/>
+            <w:tcW w:w="40" w:type="dxa"/>
             <w:tcBorders/>
             <w:vAlign w:val="bottom"/>
           </w:tcPr>
@@ -19232,7 +19199,7 @@
         </w:tc>
         <w:tc>
           <w:tcPr>
-            <w:tcW w:w="2284" w:type="dxa"/>
+            <w:tcW w:w="2283" w:type="dxa"/>
             <w:tcBorders>
               <w:bottom w:val="single" w:sz="4" w:space="0" w:color="000000"/>
               <w:end w:val="single" w:sz="4" w:space="0" w:color="000000"/>
@@ -19300,7 +19267,7 @@
         </w:tc>
         <w:tc>
           <w:tcPr>
-            <w:tcW w:w="2875" w:type="dxa"/>
+            <w:tcW w:w="2978" w:type="dxa"/>
             <w:tcBorders>
               <w:bottom w:val="single" w:sz="4" w:space="0" w:color="000000"/>
               <w:end w:val="single" w:sz="4" w:space="0" w:color="000000"/>
@@ -19334,7 +19301,7 @@
         </w:tc>
         <w:tc>
           <w:tcPr>
-            <w:tcW w:w="146" w:type="dxa"/>
+            <w:tcW w:w="40" w:type="dxa"/>
             <w:tcBorders/>
             <w:vAlign w:val="center"/>
           </w:tcPr>
@@ -19405,7 +19372,7 @@
         </w:tc>
         <w:tc>
           <w:tcPr>
-            <w:tcW w:w="2284" w:type="dxa"/>
+            <w:tcW w:w="2283" w:type="dxa"/>
             <w:tcBorders>
               <w:bottom w:val="single" w:sz="4" w:space="0" w:color="000000"/>
               <w:end w:val="single" w:sz="4" w:space="0" w:color="000000"/>
@@ -19473,7 +19440,7 @@
         </w:tc>
         <w:tc>
           <w:tcPr>
-            <w:tcW w:w="2875" w:type="dxa"/>
+            <w:tcW w:w="2978" w:type="dxa"/>
             <w:tcBorders>
               <w:bottom w:val="single" w:sz="4" w:space="0" w:color="000000"/>
               <w:end w:val="single" w:sz="4" w:space="0" w:color="000000"/>
@@ -19507,7 +19474,7 @@
         </w:tc>
         <w:tc>
           <w:tcPr>
-            <w:tcW w:w="146" w:type="dxa"/>
+            <w:tcW w:w="40" w:type="dxa"/>
             <w:tcBorders/>
             <w:vAlign w:val="center"/>
           </w:tcPr>
@@ -19578,7 +19545,7 @@
         </w:tc>
         <w:tc>
           <w:tcPr>
-            <w:tcW w:w="2284" w:type="dxa"/>
+            <w:tcW w:w="2283" w:type="dxa"/>
             <w:tcBorders>
               <w:bottom w:val="single" w:sz="4" w:space="0" w:color="000000"/>
               <w:end w:val="single" w:sz="4" w:space="0" w:color="000000"/>
@@ -19646,7 +19613,7 @@
         </w:tc>
         <w:tc>
           <w:tcPr>
-            <w:tcW w:w="2875" w:type="dxa"/>
+            <w:tcW w:w="2978" w:type="dxa"/>
             <w:tcBorders>
               <w:bottom w:val="single" w:sz="4" w:space="0" w:color="000000"/>
               <w:end w:val="single" w:sz="4" w:space="0" w:color="000000"/>
@@ -19680,7 +19647,7 @@
         </w:tc>
         <w:tc>
           <w:tcPr>
-            <w:tcW w:w="146" w:type="dxa"/>
+            <w:tcW w:w="40" w:type="dxa"/>
             <w:tcBorders/>
             <w:vAlign w:val="center"/>
           </w:tcPr>
@@ -19751,7 +19718,7 @@
         </w:tc>
         <w:tc>
           <w:tcPr>
-            <w:tcW w:w="2284" w:type="dxa"/>
+            <w:tcW w:w="2283" w:type="dxa"/>
             <w:tcBorders>
               <w:bottom w:val="single" w:sz="4" w:space="0" w:color="000000"/>
               <w:end w:val="single" w:sz="4" w:space="0" w:color="000000"/>
@@ -19819,7 +19786,7 @@
         </w:tc>
         <w:tc>
           <w:tcPr>
-            <w:tcW w:w="2875" w:type="dxa"/>
+            <w:tcW w:w="2978" w:type="dxa"/>
             <w:tcBorders>
               <w:bottom w:val="single" w:sz="4" w:space="0" w:color="000000"/>
               <w:end w:val="single" w:sz="4" w:space="0" w:color="000000"/>
@@ -19853,7 +19820,7 @@
         </w:tc>
         <w:tc>
           <w:tcPr>
-            <w:tcW w:w="146" w:type="dxa"/>
+            <w:tcW w:w="40" w:type="dxa"/>
             <w:tcBorders/>
             <w:vAlign w:val="center"/>
           </w:tcPr>
@@ -19924,7 +19891,7 @@
         </w:tc>
         <w:tc>
           <w:tcPr>
-            <w:tcW w:w="2284" w:type="dxa"/>
+            <w:tcW w:w="2283" w:type="dxa"/>
             <w:tcBorders>
               <w:bottom w:val="single" w:sz="4" w:space="0" w:color="000000"/>
               <w:end w:val="single" w:sz="4" w:space="0" w:color="000000"/>
@@ -19992,7 +19959,7 @@
         </w:tc>
         <w:tc>
           <w:tcPr>
-            <w:tcW w:w="2875" w:type="dxa"/>
+            <w:tcW w:w="2978" w:type="dxa"/>
             <w:tcBorders>
               <w:bottom w:val="single" w:sz="4" w:space="0" w:color="000000"/>
               <w:end w:val="single" w:sz="4" w:space="0" w:color="000000"/>
@@ -20022,11 +19989,31 @@
               </w:rPr>
               <w:t>HU016, HU017, HU018, HU019, HU020, HU021</w:t>
             </w:r>
-          </w:p>
-        </w:tc>
-        <w:tc>
-          <w:tcPr>
-            <w:tcW w:w="146" w:type="dxa"/>
+            <w:r>
+              <w:rPr>
+                <w:rFonts w:eastAsia="Times New Roman" w:cs="Arial" w:ascii="Arial" w:hAnsi="Arial"/>
+                <w:color w:val="000000"/>
+                <w:sz w:val="24"/>
+                <w:szCs w:val="24"/>
+                <w:lang w:val="es-MX" w:eastAsia="es-MX"/>
+              </w:rPr>
+              <w:t xml:space="preserve">, </w:t>
+            </w:r>
+            <w:r>
+              <w:rPr>
+                <w:rFonts w:eastAsia="Times New Roman" w:cs="Arial" w:ascii="Arial" w:hAnsi="Arial"/>
+                <w:color w:val="000000"/>
+                <w:sz w:val="24"/>
+                <w:szCs w:val="24"/>
+                <w:lang w:val="es-ES" w:eastAsia="es-MX"/>
+              </w:rPr>
+              <w:t>HU028</w:t>
+            </w:r>
+          </w:p>
+        </w:tc>
+        <w:tc>
+          <w:tcPr>
+            <w:tcW w:w="40" w:type="dxa"/>
             <w:tcBorders/>
             <w:vAlign w:val="center"/>
           </w:tcPr>
@@ -20097,7 +20084,7 @@
         </w:tc>
         <w:tc>
           <w:tcPr>
-            <w:tcW w:w="2284" w:type="dxa"/>
+            <w:tcW w:w="2283" w:type="dxa"/>
             <w:tcBorders>
               <w:bottom w:val="single" w:sz="4" w:space="0" w:color="000000"/>
               <w:end w:val="single" w:sz="4" w:space="0" w:color="000000"/>
@@ -20165,7 +20152,7 @@
         </w:tc>
         <w:tc>
           <w:tcPr>
-            <w:tcW w:w="2875" w:type="dxa"/>
+            <w:tcW w:w="2978" w:type="dxa"/>
             <w:tcBorders>
               <w:bottom w:val="single" w:sz="4" w:space="0" w:color="000000"/>
               <w:end w:val="single" w:sz="4" w:space="0" w:color="000000"/>
@@ -20199,7 +20186,7 @@
         </w:tc>
         <w:tc>
           <w:tcPr>
-            <w:tcW w:w="146" w:type="dxa"/>
+            <w:tcW w:w="40" w:type="dxa"/>
             <w:tcBorders/>
             <w:vAlign w:val="center"/>
           </w:tcPr>
@@ -20270,7 +20257,7 @@
         </w:tc>
         <w:tc>
           <w:tcPr>
-            <w:tcW w:w="2284" w:type="dxa"/>
+            <w:tcW w:w="2283" w:type="dxa"/>
             <w:tcBorders>
               <w:bottom w:val="single" w:sz="4" w:space="0" w:color="000000"/>
               <w:end w:val="single" w:sz="4" w:space="0" w:color="000000"/>
@@ -20338,7 +20325,7 @@
         </w:tc>
         <w:tc>
           <w:tcPr>
-            <w:tcW w:w="2875" w:type="dxa"/>
+            <w:tcW w:w="2978" w:type="dxa"/>
             <w:tcBorders>
               <w:bottom w:val="single" w:sz="4" w:space="0" w:color="000000"/>
               <w:end w:val="single" w:sz="4" w:space="0" w:color="000000"/>
@@ -20366,13 +20353,13 @@
                 <w:szCs w:val="24"/>
                 <w:lang w:val="es-ES" w:eastAsia="es-MX"/>
               </w:rPr>
-              <w:t>HU026, HU027, HU028</w:t>
-            </w:r>
-          </w:p>
-        </w:tc>
-        <w:tc>
-          <w:tcPr>
-            <w:tcW w:w="146" w:type="dxa"/>
+              <w:t>HU026, HU027</w:t>
+            </w:r>
+          </w:p>
+        </w:tc>
+        <w:tc>
+          <w:tcPr>
+            <w:tcW w:w="40" w:type="dxa"/>
             <w:tcBorders/>
             <w:vAlign w:val="center"/>
           </w:tcPr>
@@ -20460,9 +20447,8 @@
     <w:qFormat/>
     <w:pPr>
       <w:widowControl/>
-      <w:kinsoku w:val="true"/>
-      <w:overflowPunct w:val="true"/>
-      <w:autoSpaceDE w:val="true"/>
+      <w:suppressAutoHyphens w:val="true"/>
+      <w:overflowPunct w:val="false"/>
       <w:bidi w:val="0"/>
       <w:spacing w:lineRule="auto" w:line="259" w:before="0" w:after="160"/>
       <w:jc w:val="start"/>
@@ -20485,10 +20471,6 @@
     <w:pPr>
       <w:keepNext w:val="true"/>
       <w:keepLines/>
-      <w:numPr>
-        <w:ilvl w:val="0"/>
-        <w:numId w:val="0"/>
-      </w:numPr>
       <w:spacing w:before="240" w:after="0"/>
       <w:outlineLvl w:val="0"/>
     </w:pPr>
@@ -20508,10 +20490,6 @@
     <w:pPr>
       <w:keepNext w:val="true"/>
       <w:keepLines/>
-      <w:numPr>
-        <w:ilvl w:val="0"/>
-        <w:numId w:val="0"/>
-      </w:numPr>
       <w:spacing w:before="160" w:after="80"/>
       <w:outlineLvl w:val="1"/>
     </w:pPr>
@@ -20531,10 +20509,6 @@
     <w:pPr>
       <w:keepNext w:val="true"/>
       <w:keepLines/>
-      <w:numPr>
-        <w:ilvl w:val="0"/>
-        <w:numId w:val="0"/>
-      </w:numPr>
       <w:spacing w:before="160" w:after="80"/>
       <w:outlineLvl w:val="2"/>
     </w:pPr>
@@ -20554,10 +20528,6 @@
     <w:pPr>
       <w:keepNext w:val="true"/>
       <w:keepLines/>
-      <w:numPr>
-        <w:ilvl w:val="0"/>
-        <w:numId w:val="0"/>
-      </w:numPr>
       <w:spacing w:before="80" w:after="40"/>
       <w:outlineLvl w:val="3"/>
     </w:pPr>
@@ -20577,10 +20547,6 @@
     <w:pPr>
       <w:keepNext w:val="true"/>
       <w:keepLines/>
-      <w:numPr>
-        <w:ilvl w:val="0"/>
-        <w:numId w:val="0"/>
-      </w:numPr>
       <w:spacing w:before="80" w:after="40"/>
       <w:outlineLvl w:val="4"/>
     </w:pPr>
@@ -20598,10 +20564,6 @@
     <w:pPr>
       <w:keepNext w:val="true"/>
       <w:keepLines/>
-      <w:numPr>
-        <w:ilvl w:val="0"/>
-        <w:numId w:val="0"/>
-      </w:numPr>
       <w:spacing w:before="40" w:after="0"/>
       <w:outlineLvl w:val="5"/>
     </w:pPr>
@@ -20621,10 +20583,6 @@
     <w:pPr>
       <w:keepNext w:val="true"/>
       <w:keepLines/>
-      <w:numPr>
-        <w:ilvl w:val="0"/>
-        <w:numId w:val="0"/>
-      </w:numPr>
       <w:spacing w:before="40" w:after="0"/>
       <w:outlineLvl w:val="6"/>
     </w:pPr>
@@ -20642,10 +20600,6 @@
     <w:pPr>
       <w:keepNext w:val="true"/>
       <w:keepLines/>
-      <w:numPr>
-        <w:ilvl w:val="0"/>
-        <w:numId w:val="0"/>
-      </w:numPr>
       <w:spacing w:before="0" w:after="0"/>
       <w:outlineLvl w:val="7"/>
     </w:pPr>
@@ -20665,10 +20619,6 @@
     <w:pPr>
       <w:keepNext w:val="true"/>
       <w:keepLines/>
-      <w:numPr>
-        <w:ilvl w:val="0"/>
-        <w:numId w:val="0"/>
-      </w:numPr>
       <w:spacing w:before="0" w:after="0"/>
       <w:outlineLvl w:val="8"/>
     </w:pPr>
@@ -21071,9 +21021,16 @@
       <w:szCs w:val="20"/>
     </w:rPr>
   </w:style>
+  <w:style w:type="character" w:styleId="Caracteresdenotaalpieuser">
+    <w:name w:val="Caracteres de nota al pie (user)"/>
+    <w:basedOn w:val="DefaultParagraphFont"/>
+    <w:qFormat/>
+    <w:rPr>
+      <w:vertAlign w:val="superscript"/>
+    </w:rPr>
+  </w:style>
   <w:style w:type="character" w:styleId="Caracteresdenotaalpie">
     <w:name w:val="Caracteres de nota al pie"/>
-    <w:basedOn w:val="DefaultParagraphFont"/>
     <w:qFormat/>
     <w:rPr>
       <w:vertAlign w:val="superscript"/>
@@ -21094,9 +21051,16 @@
       <w:szCs w:val="20"/>
     </w:rPr>
   </w:style>
+  <w:style w:type="character" w:styleId="Caracteresdenotafinaluser">
+    <w:name w:val="Caracteres de nota final (user)"/>
+    <w:basedOn w:val="DefaultParagraphFont"/>
+    <w:qFormat/>
+    <w:rPr>
+      <w:vertAlign w:val="superscript"/>
+    </w:rPr>
+  </w:style>
   <w:style w:type="character" w:styleId="Caracteresdenotafinal">
     <w:name w:val="Caracteres de nota final"/>
-    <w:basedOn w:val="DefaultParagraphFont"/>
     <w:qFormat/>
     <w:rPr>
       <w:vertAlign w:val="superscript"/>
@@ -21215,6 +21179,32 @@
       <w:rFonts w:cs="Lucida Sans"/>
     </w:rPr>
   </w:style>
+  <w:style w:type="paragraph" w:styleId="Ttulouser">
+    <w:name w:val="Título (user)"/>
+    <w:basedOn w:val="Normal"/>
+    <w:next w:val="BodyText"/>
+    <w:qFormat/>
+    <w:pPr>
+      <w:keepNext w:val="true"/>
+      <w:spacing w:before="240" w:after="120"/>
+    </w:pPr>
+    <w:rPr>
+      <w:rFonts w:ascii="Liberation Sans" w:hAnsi="Liberation Sans" w:eastAsia="Microsoft YaHei" w:cs="Lucida Sans"/>
+      <w:sz w:val="28"/>
+      <w:szCs w:val="28"/>
+    </w:rPr>
+  </w:style>
+  <w:style w:type="paragraph" w:styleId="ndiceuser">
+    <w:name w:val="Índice (user)"/>
+    <w:basedOn w:val="Normal"/>
+    <w:qFormat/>
+    <w:pPr>
+      <w:suppressLineNumbers/>
+    </w:pPr>
+    <w:rPr>
+      <w:rFonts w:cs="Lucida Sans"/>
+    </w:rPr>
+  </w:style>
   <w:style w:type="paragraph" w:styleId="Title">
     <w:name w:val="Title"/>
     <w:basedOn w:val="Normal"/>
@@ -21301,6 +21291,13 @@
     <w:pPr>
       <w:spacing w:lineRule="auto" w:line="240" w:before="0" w:after="0"/>
     </w:pPr>
+    <w:rPr/>
+  </w:style>
+  <w:style w:type="paragraph" w:styleId="Cabeceraypieuser">
+    <w:name w:val="Cabecera y pie (user)"/>
+    <w:basedOn w:val="Normal"/>
+    <w:qFormat/>
+    <w:pPr/>
     <w:rPr/>
   </w:style>
   <w:style w:type="paragraph" w:styleId="Cabeceraypie">
@@ -21453,7 +21450,7 @@
   </w:style>
   <w:style w:type="paragraph" w:styleId="IndexHeading">
     <w:name w:val="index heading"/>
-    <w:basedOn w:val="Ttulo"/>
+    <w:basedOn w:val="Ttulouser"/>
     <w:pPr/>
     <w:rPr/>
   </w:style>
@@ -21462,9 +21459,8 @@
     <w:qFormat/>
     <w:pPr>
       <w:widowControl/>
-      <w:kinsoku w:val="true"/>
-      <w:overflowPunct w:val="true"/>
-      <w:autoSpaceDE w:val="true"/>
+      <w:suppressAutoHyphens w:val="true"/>
+      <w:overflowPunct w:val="false"/>
       <w:bidi w:val="0"/>
       <w:spacing w:lineRule="auto" w:line="259" w:before="0" w:after="160"/>
       <w:jc w:val="start"/>
@@ -21500,6 +21496,29 @@
       <w:lang w:val="es-ES" w:eastAsia="en-US"/>
     </w:rPr>
   </w:style>
+  <w:style w:type="paragraph" w:styleId="Contenidodelatablauser">
+    <w:name w:val="Contenido de la tabla (user)"/>
+    <w:basedOn w:val="Normal"/>
+    <w:qFormat/>
+    <w:pPr>
+      <w:widowControl w:val="false"/>
+      <w:suppressLineNumbers/>
+    </w:pPr>
+    <w:rPr/>
+  </w:style>
+  <w:style w:type="paragraph" w:styleId="Ttulodelatablauser">
+    <w:name w:val="Título de la tabla (user)"/>
+    <w:basedOn w:val="Contenidodelatablauser"/>
+    <w:qFormat/>
+    <w:pPr>
+      <w:suppressLineNumbers/>
+      <w:jc w:val="center"/>
+    </w:pPr>
+    <w:rPr>
+      <w:b/>
+      <w:bCs/>
+    </w:rPr>
+  </w:style>
   <w:style w:type="paragraph" w:styleId="Contenidodelatabla">
     <w:name w:val="Contenido de la tabla"/>
     <w:basedOn w:val="Normal"/>
@@ -21523,8 +21542,8 @@
       <w:bCs/>
     </w:rPr>
   </w:style>
-  <w:style w:type="numbering" w:styleId="Ningunalista">
-    <w:name w:val="Ninguna lista"/>
+  <w:style w:type="numbering" w:styleId="Ningunalistauser">
+    <w:name w:val="Ninguna lista (user)"/>
     <w:qFormat/>
   </w:style>
 </w:styles>
@@ -21538,37 +21557,37 @@
         <a:srgbClr val="000000"/>
       </a:dk1>
       <a:lt1>
-        <a:srgbClr val="ffffff"/>
+        <a:srgbClr val="FFFFFF"/>
       </a:lt1>
       <a:dk2>
-        <a:srgbClr val="44546a"/>
+        <a:srgbClr val="44546A"/>
       </a:dk2>
       <a:lt2>
-        <a:srgbClr val="e7e6e6"/>
+        <a:srgbClr val="E7E6E6"/>
       </a:lt2>
       <a:accent1>
-        <a:srgbClr val="4472c4"/>
+        <a:srgbClr val="4472C4"/>
       </a:accent1>
       <a:accent2>
-        <a:srgbClr val="ed7d31"/>
+        <a:srgbClr val="ED7D31"/>
       </a:accent2>
       <a:accent3>
-        <a:srgbClr val="a5a5a5"/>
+        <a:srgbClr val="A5A5A5"/>
       </a:accent3>
       <a:accent4>
-        <a:srgbClr val="ffc000"/>
+        <a:srgbClr val="FFC000"/>
       </a:accent4>
       <a:accent5>
-        <a:srgbClr val="5b9bd5"/>
+        <a:srgbClr val="5B9BD5"/>
       </a:accent5>
       <a:accent6>
-        <a:srgbClr val="70ad47"/>
+        <a:srgbClr val="70AD47"/>
       </a:accent6>
       <a:hlink>
-        <a:srgbClr val="0563c1"/>
+        <a:srgbClr val="0563C1"/>
       </a:hlink>
       <a:folHlink>
-        <a:srgbClr val="954f72"/>
+        <a:srgbClr val="954F72"/>
       </a:folHlink>
     </a:clrScheme>
     <a:fontScheme name="Office">

</xml_diff>